<commit_message>
add UML Class Diagrams section to the report
</commit_message>
<xml_diff>
--- a/docs/deliverables/3.1/Deliverable 3-1 Design and GUI- Submission - Submission.docx
+++ b/docs/deliverables/3.1/Deliverable 3-1 Design and GUI- Submission - Submission.docx
@@ -2355,6 +2355,504 @@
       <w:bookmarkEnd w:id="10"/>
     </w:p>
     <w:p>
+      <w:r>
+        <w:t xml:space="preserve">This section presents the UML class diagrams for </w:t>
+      </w:r>
+      <w:proofErr w:type="spellStart"/>
+      <w:r>
+        <w:t>SmartBudget</w:t>
+      </w:r>
+      <w:proofErr w:type="spellEnd"/>
+      <w:r>
+        <w:t>. The diagrams describe the system’s static structure, including the main classes, their attributes and operations, and how they relate to each other through associations and dependencies. We include a high-level class diagram to give an overall picture of the architecture, followed by three detailed diagrams that break the design into the main modules: Transactions, Budgets &amp; Alerts, and Reports. Together, these diagrams show how responsibilities are separated across controllers, services, domain entities, and storage-related components.</w:t>
+      </w:r>
+    </w:p>
+    <w:p>
+      <w:pPr>
+        <w:pStyle w:val="Heading2"/>
+      </w:pPr>
+      <w:r>
+        <w:t>High-Level Class Diagram (System-Wide View)</w:t>
+      </w:r>
+    </w:p>
+    <w:p>
+      <w:r>
+        <w:t xml:space="preserve">The high-level class diagram presents the overall structure of </w:t>
+      </w:r>
+      <w:proofErr w:type="spellStart"/>
+      <w:r>
+        <w:t>SmartBudget</w:t>
+      </w:r>
+      <w:proofErr w:type="spellEnd"/>
+      <w:r>
+        <w:t>, showing how the main controllers interact with their services, how services use domain entities, and how persistence is abstracted through a storage component. This view highlights the separation between UI logic and business logic.</w:t>
+      </w:r>
+    </w:p>
+    <w:p/>
+    <w:p>
+      <w:pPr>
+        <w:rPr>
+          <w:color w:val="EE0000"/>
+          <w:sz w:val="36"/>
+          <w:szCs w:val="32"/>
+        </w:rPr>
+      </w:pPr>
+      <w:r>
+        <w:rPr>
+          <w:color w:val="EE0000"/>
+          <w:sz w:val="36"/>
+          <w:szCs w:val="32"/>
+          <w:highlight w:val="yellow"/>
+        </w:rPr>
+        <w:t>Insert figure: High-level class diagram screenshot</w:t>
+      </w:r>
+    </w:p>
+    <w:p>
+      <w:pPr>
+        <w:pStyle w:val="Heading2"/>
+      </w:pPr>
+      <w:r>
+        <w:t>Class Diagram A — Transactions Module</w:t>
+      </w:r>
+    </w:p>
+    <w:p>
+      <w:r>
+        <w:t xml:space="preserve">This diagram focuses on transaction-related functionality, including recording and managing transactions. Key classes include </w:t>
+      </w:r>
+      <w:proofErr w:type="spellStart"/>
+      <w:r>
+        <w:rPr>
+          <w:i/>
+          <w:iCs/>
+        </w:rPr>
+        <w:t>TransactionsController</w:t>
+      </w:r>
+      <w:proofErr w:type="spellEnd"/>
+      <w:r>
+        <w:t xml:space="preserve">, </w:t>
+      </w:r>
+      <w:proofErr w:type="spellStart"/>
+      <w:r>
+        <w:rPr>
+          <w:i/>
+          <w:iCs/>
+        </w:rPr>
+        <w:t>TransactionService</w:t>
+      </w:r>
+      <w:proofErr w:type="spellEnd"/>
+      <w:r>
+        <w:t xml:space="preserve">, and the </w:t>
+      </w:r>
+      <w:r>
+        <w:rPr>
+          <w:i/>
+          <w:iCs/>
+        </w:rPr>
+        <w:t>Transaction</w:t>
+      </w:r>
+      <w:r>
+        <w:t xml:space="preserve"> domain entity. It also shows supporting classes such as </w:t>
+      </w:r>
+      <w:proofErr w:type="spellStart"/>
+      <w:r>
+        <w:rPr>
+          <w:i/>
+          <w:iCs/>
+        </w:rPr>
+        <w:t>TransactionFilter</w:t>
+      </w:r>
+      <w:proofErr w:type="spellEnd"/>
+      <w:r>
+        <w:t xml:space="preserve"> for filtering logic and shared components like </w:t>
+      </w:r>
+      <w:r>
+        <w:rPr>
+          <w:i/>
+          <w:iCs/>
+        </w:rPr>
+        <w:t>Validator</w:t>
+      </w:r>
+      <w:r>
+        <w:t xml:space="preserve">, </w:t>
+      </w:r>
+      <w:proofErr w:type="spellStart"/>
+      <w:r>
+        <w:rPr>
+          <w:i/>
+          <w:iCs/>
+        </w:rPr>
+        <w:t>AlertService</w:t>
+      </w:r>
+      <w:proofErr w:type="spellEnd"/>
+      <w:r>
+        <w:t xml:space="preserve">, and </w:t>
+      </w:r>
+      <w:proofErr w:type="spellStart"/>
+      <w:r>
+        <w:rPr>
+          <w:i/>
+          <w:iCs/>
+        </w:rPr>
+        <w:t>JsonStorage</w:t>
+      </w:r>
+      <w:proofErr w:type="spellEnd"/>
+      <w:r>
+        <w:t>.</w:t>
+      </w:r>
+    </w:p>
+    <w:p>
+      <w:pPr>
+        <w:rPr>
+          <w:color w:val="EE0000"/>
+          <w:sz w:val="36"/>
+          <w:szCs w:val="32"/>
+        </w:rPr>
+      </w:pPr>
+      <w:r>
+        <w:rPr>
+          <w:color w:val="EE0000"/>
+          <w:sz w:val="36"/>
+          <w:szCs w:val="32"/>
+          <w:highlight w:val="yellow"/>
+        </w:rPr>
+        <w:t>Insert figure: Class Diagram A screenshot</w:t>
+      </w:r>
+    </w:p>
+    <w:p>
+      <w:pPr>
+        <w:pStyle w:val="Heading2"/>
+      </w:pPr>
+      <w:r>
+        <w:lastRenderedPageBreak/>
+        <w:t>Class Diagram B — Budgets and Alerts Module</w:t>
+      </w:r>
+    </w:p>
+    <w:p>
+      <w:r>
+        <w:t xml:space="preserve">This diagram focuses on setting budgets and checking overspending alerts. The </w:t>
+      </w:r>
+      <w:proofErr w:type="spellStart"/>
+      <w:r>
+        <w:rPr>
+          <w:i/>
+          <w:iCs/>
+        </w:rPr>
+        <w:t>BudgetsController</w:t>
+      </w:r>
+      <w:proofErr w:type="spellEnd"/>
+      <w:r>
+        <w:t xml:space="preserve"> works with </w:t>
+      </w:r>
+      <w:proofErr w:type="spellStart"/>
+      <w:r>
+        <w:rPr>
+          <w:i/>
+          <w:iCs/>
+        </w:rPr>
+        <w:t>BudgetService</w:t>
+      </w:r>
+      <w:proofErr w:type="spellEnd"/>
+      <w:r>
+        <w:t xml:space="preserve"> to create or update monthly budgets, while </w:t>
+      </w:r>
+      <w:proofErr w:type="spellStart"/>
+      <w:r>
+        <w:rPr>
+          <w:i/>
+          <w:iCs/>
+        </w:rPr>
+        <w:t>AlertService</w:t>
+      </w:r>
+      <w:proofErr w:type="spellEnd"/>
+      <w:r>
+        <w:t xml:space="preserve"> compares budget limits with transaction totals. Shared dependencies include </w:t>
+      </w:r>
+      <w:proofErr w:type="spellStart"/>
+      <w:r>
+        <w:rPr>
+          <w:i/>
+          <w:iCs/>
+        </w:rPr>
+        <w:t>TransactionService</w:t>
+      </w:r>
+      <w:proofErr w:type="spellEnd"/>
+      <w:r>
+        <w:t xml:space="preserve">, </w:t>
+      </w:r>
+      <w:r>
+        <w:rPr>
+          <w:i/>
+          <w:iCs/>
+        </w:rPr>
+        <w:t>Validator</w:t>
+      </w:r>
+      <w:r>
+        <w:t>, and storage (</w:t>
+      </w:r>
+      <w:proofErr w:type="spellStart"/>
+      <w:r>
+        <w:rPr>
+          <w:i/>
+          <w:iCs/>
+        </w:rPr>
+        <w:t>JsonStorage</w:t>
+      </w:r>
+      <w:proofErr w:type="spellEnd"/>
+      <w:r>
+        <w:t xml:space="preserve"> / </w:t>
+      </w:r>
+      <w:r>
+        <w:rPr>
+          <w:i/>
+          <w:iCs/>
+        </w:rPr>
+        <w:t>Storage</w:t>
+      </w:r>
+      <w:r>
+        <w:t xml:space="preserve"> interface).</w:t>
+      </w:r>
+    </w:p>
+    <w:p>
+      <w:pPr>
+        <w:rPr>
+          <w:color w:val="EE0000"/>
+          <w:sz w:val="36"/>
+          <w:szCs w:val="32"/>
+        </w:rPr>
+      </w:pPr>
+      <w:r>
+        <w:rPr>
+          <w:color w:val="EE0000"/>
+          <w:sz w:val="36"/>
+          <w:szCs w:val="32"/>
+          <w:highlight w:val="yellow"/>
+        </w:rPr>
+        <w:t>Insert figure: Class Diagram B screenshot</w:t>
+      </w:r>
+    </w:p>
+    <w:p>
+      <w:pPr>
+        <w:pStyle w:val="Heading2"/>
+      </w:pPr>
+      <w:r>
+        <w:t>Class Diagram C — Reports Module</w:t>
+      </w:r>
+    </w:p>
+    <w:p>
+      <w:r>
+        <w:t xml:space="preserve">This diagram focuses on reporting features. </w:t>
+      </w:r>
+      <w:proofErr w:type="spellStart"/>
+      <w:r>
+        <w:rPr>
+          <w:i/>
+          <w:iCs/>
+        </w:rPr>
+        <w:t>ReportsController</w:t>
+      </w:r>
+      <w:proofErr w:type="spellEnd"/>
+      <w:r>
+        <w:t xml:space="preserve"> requests reports from </w:t>
+      </w:r>
+      <w:proofErr w:type="spellStart"/>
+      <w:r>
+        <w:rPr>
+          <w:i/>
+          <w:iCs/>
+        </w:rPr>
+        <w:t>ReportService</w:t>
+      </w:r>
+      <w:proofErr w:type="spellEnd"/>
+      <w:r>
+        <w:t xml:space="preserve">, which uses </w:t>
+      </w:r>
+      <w:proofErr w:type="spellStart"/>
+      <w:r>
+        <w:rPr>
+          <w:i/>
+          <w:iCs/>
+        </w:rPr>
+        <w:t>TransactionService</w:t>
+      </w:r>
+      <w:proofErr w:type="spellEnd"/>
+      <w:r>
+        <w:t xml:space="preserve"> to retrieve transactions in a selected period. Report results are represented through reporting objects such as </w:t>
+      </w:r>
+      <w:proofErr w:type="spellStart"/>
+      <w:r>
+        <w:rPr>
+          <w:i/>
+          <w:iCs/>
+        </w:rPr>
+        <w:t>SummaryReport</w:t>
+      </w:r>
+      <w:proofErr w:type="spellEnd"/>
+      <w:r>
+        <w:t xml:space="preserve">, </w:t>
+      </w:r>
+      <w:proofErr w:type="spellStart"/>
+      <w:r>
+        <w:rPr>
+          <w:i/>
+          <w:iCs/>
+        </w:rPr>
+        <w:t>CategoryTotal</w:t>
+      </w:r>
+      <w:proofErr w:type="spellEnd"/>
+      <w:r>
+        <w:t xml:space="preserve">, and </w:t>
+      </w:r>
+      <w:proofErr w:type="spellStart"/>
+      <w:r>
+        <w:rPr>
+          <w:i/>
+          <w:iCs/>
+        </w:rPr>
+        <w:t>ReportResult</w:t>
+      </w:r>
+      <w:proofErr w:type="spellEnd"/>
+      <w:r>
+        <w:t>, which structure the report output in a clean and testable way.</w:t>
+      </w:r>
+    </w:p>
+    <w:p>
+      <w:pPr>
+        <w:rPr>
+          <w:color w:val="EE0000"/>
+          <w:sz w:val="36"/>
+          <w:szCs w:val="32"/>
+        </w:rPr>
+      </w:pPr>
+      <w:r>
+        <w:rPr>
+          <w:color w:val="EE0000"/>
+          <w:sz w:val="36"/>
+          <w:szCs w:val="32"/>
+          <w:highlight w:val="yellow"/>
+        </w:rPr>
+        <w:t>Insert figure: Class Diagram C screenshot</w:t>
+      </w:r>
+    </w:p>
+    <w:p>
+      <w:pPr>
+        <w:pStyle w:val="Heading2"/>
+      </w:pPr>
+      <w:r>
+        <w:t>Cross-Cutting Classes Used Across Modules</w:t>
+      </w:r>
+    </w:p>
+    <w:p>
+      <w:pPr>
+        <w:rPr>
+          <w:lang w:val="en-CA"/>
+        </w:rPr>
+      </w:pPr>
+      <w:r>
+        <w:rPr>
+          <w:lang w:val="en-CA"/>
+        </w:rPr>
+        <w:t>Several components are shared across multiple modules:</w:t>
+      </w:r>
+    </w:p>
+    <w:p>
+      <w:pPr>
+        <w:pStyle w:val="ListParagraph"/>
+        <w:numPr>
+          <w:ilvl w:val="0"/>
+          <w:numId w:val="102"/>
+        </w:numPr>
+        <w:rPr>
+          <w:lang w:val="en-CA"/>
+        </w:rPr>
+      </w:pPr>
+      <w:r>
+        <w:rPr>
+          <w:b/>
+          <w:bCs/>
+          <w:lang w:val="en-CA"/>
+        </w:rPr>
+        <w:t>Validator:</w:t>
+      </w:r>
+      <w:r>
+        <w:rPr>
+          <w:lang w:val="en-CA"/>
+        </w:rPr>
+        <w:t xml:space="preserve"> Central validation rules used before creating/updating objects.</w:t>
+      </w:r>
+    </w:p>
+    <w:p>
+      <w:pPr>
+        <w:pStyle w:val="ListParagraph"/>
+        <w:numPr>
+          <w:ilvl w:val="0"/>
+          <w:numId w:val="102"/>
+        </w:numPr>
+        <w:rPr>
+          <w:lang w:val="en-CA"/>
+        </w:rPr>
+      </w:pPr>
+      <w:proofErr w:type="spellStart"/>
+      <w:r>
+        <w:rPr>
+          <w:b/>
+          <w:bCs/>
+          <w:lang w:val="en-CA"/>
+        </w:rPr>
+        <w:t>JsonStorage</w:t>
+      </w:r>
+      <w:proofErr w:type="spellEnd"/>
+      <w:r>
+        <w:rPr>
+          <w:b/>
+          <w:bCs/>
+          <w:lang w:val="en-CA"/>
+        </w:rPr>
+        <w:t xml:space="preserve"> / Storage:</w:t>
+      </w:r>
+      <w:r>
+        <w:rPr>
+          <w:lang w:val="en-CA"/>
+        </w:rPr>
+        <w:t xml:space="preserve"> Abstraction for saving and loading data.</w:t>
+      </w:r>
+    </w:p>
+    <w:p>
+      <w:pPr>
+        <w:pStyle w:val="ListParagraph"/>
+        <w:numPr>
+          <w:ilvl w:val="0"/>
+          <w:numId w:val="102"/>
+        </w:numPr>
+        <w:rPr>
+          <w:lang w:val="en-CA"/>
+        </w:rPr>
+      </w:pPr>
+      <w:proofErr w:type="spellStart"/>
+      <w:r>
+        <w:rPr>
+          <w:b/>
+          <w:bCs/>
+          <w:lang w:val="en-CA"/>
+        </w:rPr>
+        <w:t>AlertService</w:t>
+      </w:r>
+      <w:proofErr w:type="spellEnd"/>
+      <w:r>
+        <w:rPr>
+          <w:b/>
+          <w:bCs/>
+          <w:lang w:val="en-CA"/>
+        </w:rPr>
+        <w:t>:</w:t>
+      </w:r>
+      <w:r>
+        <w:rPr>
+          <w:lang w:val="en-CA"/>
+        </w:rPr>
+        <w:t xml:space="preserve"> Used by both transactions and budgets to detect overspending situations.</w:t>
+      </w:r>
+    </w:p>
+    <w:p>
       <w:pPr>
         <w:pStyle w:val="Heading1"/>
       </w:pPr>
@@ -2369,14 +2867,49 @@
       <w:bookmarkEnd w:id="13"/>
     </w:p>
     <w:p>
+      <w:r>
+        <w:t xml:space="preserve">This section includes the sequence diagrams for </w:t>
+      </w:r>
+      <w:proofErr w:type="spellStart"/>
+      <w:r>
+        <w:t>SmartBudget</w:t>
+      </w:r>
+      <w:proofErr w:type="spellEnd"/>
+      <w:r>
+        <w:t xml:space="preserve">, which illustrate the system’s runtime </w:t>
+      </w:r>
+      <w:proofErr w:type="spellStart"/>
+      <w:r>
+        <w:t>behavior</w:t>
+      </w:r>
+      <w:proofErr w:type="spellEnd"/>
+      <w:r>
+        <w:t xml:space="preserve"> for key workflows. Each diagram shows the step-by-step interaction between the user interface (controllers), service layer, and domain objects, including how validation and results are handled. The selected sequence diagrams represent critical use cases and demonstrate how the system processes user requests from the moment the user triggers an action in the GUI to the point where the business logic completes and a response is returned to the UI.</w:t>
+      </w:r>
+    </w:p>
+    <w:p>
       <w:pPr>
         <w:pStyle w:val="Heading1"/>
       </w:pPr>
       <w:bookmarkStart w:id="14" w:name="_Toc222046835"/>
       <w:r>
+        <w:lastRenderedPageBreak/>
         <w:t>Activity Diagrams (major workflows)</w:t>
       </w:r>
       <w:bookmarkEnd w:id="14"/>
+    </w:p>
+    <w:p>
+      <w:r>
+        <w:t xml:space="preserve">This section provides the activity diagrams for </w:t>
+      </w:r>
+      <w:proofErr w:type="spellStart"/>
+      <w:r>
+        <w:t>SmartBudget</w:t>
+      </w:r>
+      <w:proofErr w:type="spellEnd"/>
+      <w:r>
+        <w:t>. These diagrams describe the control flow of major user workflows, including actions, decision points, and alternate paths such as invalid inputs or cancellation. The activity diagrams complement the sequence diagrams by focusing on the overall process logic rather than object-to-object messages. Together, they show how the application guides the user through tasks like recording or amending transactions, setting and updating budgets, generating reports, and initializing the system on startup.</w:t>
+      </w:r>
     </w:p>
     <w:p>
       <w:pPr>
@@ -7395,6 +7928,119 @@
     </w:lvl>
   </w:abstractNum>
   <w:abstractNum w:abstractNumId="44" w15:restartNumberingAfterBreak="0">
+    <w:nsid w:val="422A0094"/>
+    <w:multiLevelType w:val="hybridMultilevel"/>
+    <w:tmpl w:val="ACA0E0A4"/>
+    <w:lvl w:ilvl="0" w:tplc="10090001">
+      <w:start w:val="1"/>
+      <w:numFmt w:val="bullet"/>
+      <w:lvlText w:val=""/>
+      <w:lvlJc w:val="left"/>
+      <w:pPr>
+        <w:ind w:left="1287" w:hanging="360"/>
+      </w:pPr>
+      <w:rPr>
+        <w:rFonts w:ascii="Symbol" w:hAnsi="Symbol" w:hint="default"/>
+      </w:rPr>
+    </w:lvl>
+    <w:lvl w:ilvl="1" w:tplc="10090003" w:tentative="1">
+      <w:start w:val="1"/>
+      <w:numFmt w:val="bullet"/>
+      <w:lvlText w:val="o"/>
+      <w:lvlJc w:val="left"/>
+      <w:pPr>
+        <w:ind w:left="2007" w:hanging="360"/>
+      </w:pPr>
+      <w:rPr>
+        <w:rFonts w:ascii="Courier New" w:hAnsi="Courier New" w:cs="Courier New" w:hint="default"/>
+      </w:rPr>
+    </w:lvl>
+    <w:lvl w:ilvl="2" w:tplc="10090005" w:tentative="1">
+      <w:start w:val="1"/>
+      <w:numFmt w:val="bullet"/>
+      <w:lvlText w:val=""/>
+      <w:lvlJc w:val="left"/>
+      <w:pPr>
+        <w:ind w:left="2727" w:hanging="360"/>
+      </w:pPr>
+      <w:rPr>
+        <w:rFonts w:ascii="Wingdings" w:hAnsi="Wingdings" w:hint="default"/>
+      </w:rPr>
+    </w:lvl>
+    <w:lvl w:ilvl="3" w:tplc="10090001" w:tentative="1">
+      <w:start w:val="1"/>
+      <w:numFmt w:val="bullet"/>
+      <w:lvlText w:val=""/>
+      <w:lvlJc w:val="left"/>
+      <w:pPr>
+        <w:ind w:left="3447" w:hanging="360"/>
+      </w:pPr>
+      <w:rPr>
+        <w:rFonts w:ascii="Symbol" w:hAnsi="Symbol" w:hint="default"/>
+      </w:rPr>
+    </w:lvl>
+    <w:lvl w:ilvl="4" w:tplc="10090003" w:tentative="1">
+      <w:start w:val="1"/>
+      <w:numFmt w:val="bullet"/>
+      <w:lvlText w:val="o"/>
+      <w:lvlJc w:val="left"/>
+      <w:pPr>
+        <w:ind w:left="4167" w:hanging="360"/>
+      </w:pPr>
+      <w:rPr>
+        <w:rFonts w:ascii="Courier New" w:hAnsi="Courier New" w:cs="Courier New" w:hint="default"/>
+      </w:rPr>
+    </w:lvl>
+    <w:lvl w:ilvl="5" w:tplc="10090005" w:tentative="1">
+      <w:start w:val="1"/>
+      <w:numFmt w:val="bullet"/>
+      <w:lvlText w:val=""/>
+      <w:lvlJc w:val="left"/>
+      <w:pPr>
+        <w:ind w:left="4887" w:hanging="360"/>
+      </w:pPr>
+      <w:rPr>
+        <w:rFonts w:ascii="Wingdings" w:hAnsi="Wingdings" w:hint="default"/>
+      </w:rPr>
+    </w:lvl>
+    <w:lvl w:ilvl="6" w:tplc="10090001" w:tentative="1">
+      <w:start w:val="1"/>
+      <w:numFmt w:val="bullet"/>
+      <w:lvlText w:val=""/>
+      <w:lvlJc w:val="left"/>
+      <w:pPr>
+        <w:ind w:left="5607" w:hanging="360"/>
+      </w:pPr>
+      <w:rPr>
+        <w:rFonts w:ascii="Symbol" w:hAnsi="Symbol" w:hint="default"/>
+      </w:rPr>
+    </w:lvl>
+    <w:lvl w:ilvl="7" w:tplc="10090003" w:tentative="1">
+      <w:start w:val="1"/>
+      <w:numFmt w:val="bullet"/>
+      <w:lvlText w:val="o"/>
+      <w:lvlJc w:val="left"/>
+      <w:pPr>
+        <w:ind w:left="6327" w:hanging="360"/>
+      </w:pPr>
+      <w:rPr>
+        <w:rFonts w:ascii="Courier New" w:hAnsi="Courier New" w:cs="Courier New" w:hint="default"/>
+      </w:rPr>
+    </w:lvl>
+    <w:lvl w:ilvl="8" w:tplc="10090005" w:tentative="1">
+      <w:start w:val="1"/>
+      <w:numFmt w:val="bullet"/>
+      <w:lvlText w:val=""/>
+      <w:lvlJc w:val="left"/>
+      <w:pPr>
+        <w:ind w:left="7047" w:hanging="360"/>
+      </w:pPr>
+      <w:rPr>
+        <w:rFonts w:ascii="Wingdings" w:hAnsi="Wingdings" w:hint="default"/>
+      </w:rPr>
+    </w:lvl>
+  </w:abstractNum>
+  <w:abstractNum w:abstractNumId="45" w15:restartNumberingAfterBreak="0">
     <w:nsid w:val="42B30C52"/>
     <w:multiLevelType w:val="hybridMultilevel"/>
     <w:tmpl w:val="3CE0E434"/>
@@ -7485,7 +8131,7 @@
       </w:pPr>
     </w:lvl>
   </w:abstractNum>
-  <w:abstractNum w:abstractNumId="45" w15:restartNumberingAfterBreak="0">
+  <w:abstractNum w:abstractNumId="46" w15:restartNumberingAfterBreak="0">
     <w:nsid w:val="4358458D"/>
     <w:multiLevelType w:val="hybridMultilevel"/>
     <w:tmpl w:val="D674985A"/>
@@ -7598,7 +8244,7 @@
       </w:rPr>
     </w:lvl>
   </w:abstractNum>
-  <w:abstractNum w:abstractNumId="46" w15:restartNumberingAfterBreak="0">
+  <w:abstractNum w:abstractNumId="47" w15:restartNumberingAfterBreak="0">
     <w:nsid w:val="437C285D"/>
     <w:multiLevelType w:val="multilevel"/>
     <w:tmpl w:val="5D7A6698"/>
@@ -7711,7 +8357,7 @@
       </w:pPr>
     </w:lvl>
   </w:abstractNum>
-  <w:abstractNum w:abstractNumId="47" w15:restartNumberingAfterBreak="0">
+  <w:abstractNum w:abstractNumId="48" w15:restartNumberingAfterBreak="0">
     <w:nsid w:val="4508004E"/>
     <w:multiLevelType w:val="multilevel"/>
     <w:tmpl w:val="DB9A5EB8"/>
@@ -7824,7 +8470,7 @@
       </w:pPr>
     </w:lvl>
   </w:abstractNum>
-  <w:abstractNum w:abstractNumId="48" w15:restartNumberingAfterBreak="0">
+  <w:abstractNum w:abstractNumId="49" w15:restartNumberingAfterBreak="0">
     <w:nsid w:val="455F206D"/>
     <w:multiLevelType w:val="hybridMultilevel"/>
     <w:tmpl w:val="567E9F4C"/>
@@ -7937,7 +8583,7 @@
       </w:rPr>
     </w:lvl>
   </w:abstractNum>
-  <w:abstractNum w:abstractNumId="49" w15:restartNumberingAfterBreak="0">
+  <w:abstractNum w:abstractNumId="50" w15:restartNumberingAfterBreak="0">
     <w:nsid w:val="46D52C44"/>
     <w:multiLevelType w:val="hybridMultilevel"/>
     <w:tmpl w:val="3CE0E434"/>
@@ -8028,7 +8674,7 @@
       </w:pPr>
     </w:lvl>
   </w:abstractNum>
-  <w:abstractNum w:abstractNumId="50" w15:restartNumberingAfterBreak="0">
+  <w:abstractNum w:abstractNumId="51" w15:restartNumberingAfterBreak="0">
     <w:nsid w:val="495868AF"/>
     <w:multiLevelType w:val="multilevel"/>
     <w:tmpl w:val="AF5E2D98"/>
@@ -8141,7 +8787,7 @@
       </w:pPr>
     </w:lvl>
   </w:abstractNum>
-  <w:abstractNum w:abstractNumId="51" w15:restartNumberingAfterBreak="0">
+  <w:abstractNum w:abstractNumId="52" w15:restartNumberingAfterBreak="0">
     <w:nsid w:val="4A37709D"/>
     <w:multiLevelType w:val="multilevel"/>
     <w:tmpl w:val="3078ECCC"/>
@@ -8254,7 +8900,7 @@
       </w:pPr>
     </w:lvl>
   </w:abstractNum>
-  <w:abstractNum w:abstractNumId="52" w15:restartNumberingAfterBreak="0">
+  <w:abstractNum w:abstractNumId="53" w15:restartNumberingAfterBreak="0">
     <w:nsid w:val="4A6D04CD"/>
     <w:multiLevelType w:val="multilevel"/>
     <w:tmpl w:val="AC9C6A86"/>
@@ -8367,7 +9013,7 @@
       </w:pPr>
     </w:lvl>
   </w:abstractNum>
-  <w:abstractNum w:abstractNumId="53" w15:restartNumberingAfterBreak="0">
+  <w:abstractNum w:abstractNumId="54" w15:restartNumberingAfterBreak="0">
     <w:nsid w:val="4D7249A5"/>
     <w:multiLevelType w:val="multilevel"/>
     <w:tmpl w:val="1794DB7A"/>
@@ -8480,7 +9126,7 @@
       </w:pPr>
     </w:lvl>
   </w:abstractNum>
-  <w:abstractNum w:abstractNumId="54" w15:restartNumberingAfterBreak="0">
+  <w:abstractNum w:abstractNumId="55" w15:restartNumberingAfterBreak="0">
     <w:nsid w:val="506A45CE"/>
     <w:multiLevelType w:val="hybridMultilevel"/>
     <w:tmpl w:val="8556C9F8"/>
@@ -8593,7 +9239,7 @@
       </w:rPr>
     </w:lvl>
   </w:abstractNum>
-  <w:abstractNum w:abstractNumId="55" w15:restartNumberingAfterBreak="0">
+  <w:abstractNum w:abstractNumId="56" w15:restartNumberingAfterBreak="0">
     <w:nsid w:val="50727983"/>
     <w:multiLevelType w:val="hybridMultilevel"/>
     <w:tmpl w:val="3CE0E434"/>
@@ -8684,7 +9330,7 @@
       </w:pPr>
     </w:lvl>
   </w:abstractNum>
-  <w:abstractNum w:abstractNumId="56" w15:restartNumberingAfterBreak="0">
+  <w:abstractNum w:abstractNumId="57" w15:restartNumberingAfterBreak="0">
     <w:nsid w:val="51C11079"/>
     <w:multiLevelType w:val="multilevel"/>
     <w:tmpl w:val="59CAEE68"/>
@@ -8797,7 +9443,7 @@
       </w:pPr>
     </w:lvl>
   </w:abstractNum>
-  <w:abstractNum w:abstractNumId="57" w15:restartNumberingAfterBreak="0">
+  <w:abstractNum w:abstractNumId="58" w15:restartNumberingAfterBreak="0">
     <w:nsid w:val="51FA2BC8"/>
     <w:multiLevelType w:val="multilevel"/>
     <w:tmpl w:val="9FF62EE4"/>
@@ -8946,7 +9592,156 @@
       </w:rPr>
     </w:lvl>
   </w:abstractNum>
-  <w:abstractNum w:abstractNumId="58" w15:restartNumberingAfterBreak="0">
+  <w:abstractNum w:abstractNumId="59" w15:restartNumberingAfterBreak="0">
+    <w:nsid w:val="53BB68D3"/>
+    <w:multiLevelType w:val="multilevel"/>
+    <w:tmpl w:val="8392F54C"/>
+    <w:lvl w:ilvl="0">
+      <w:start w:val="1"/>
+      <w:numFmt w:val="bullet"/>
+      <w:lvlText w:val=""/>
+      <w:lvlJc w:val="left"/>
+      <w:pPr>
+        <w:tabs>
+          <w:tab w:val="num" w:pos="720"/>
+        </w:tabs>
+        <w:ind w:left="720" w:hanging="360"/>
+      </w:pPr>
+      <w:rPr>
+        <w:rFonts w:ascii="Symbol" w:hAnsi="Symbol" w:hint="default"/>
+        <w:sz w:val="20"/>
+      </w:rPr>
+    </w:lvl>
+    <w:lvl w:ilvl="1" w:tentative="1">
+      <w:start w:val="1"/>
+      <w:numFmt w:val="bullet"/>
+      <w:lvlText w:val="o"/>
+      <w:lvlJc w:val="left"/>
+      <w:pPr>
+        <w:tabs>
+          <w:tab w:val="num" w:pos="1440"/>
+        </w:tabs>
+        <w:ind w:left="1440" w:hanging="360"/>
+      </w:pPr>
+      <w:rPr>
+        <w:rFonts w:ascii="Courier New" w:hAnsi="Courier New" w:hint="default"/>
+        <w:sz w:val="20"/>
+      </w:rPr>
+    </w:lvl>
+    <w:lvl w:ilvl="2" w:tentative="1">
+      <w:start w:val="1"/>
+      <w:numFmt w:val="bullet"/>
+      <w:lvlText w:val=""/>
+      <w:lvlJc w:val="left"/>
+      <w:pPr>
+        <w:tabs>
+          <w:tab w:val="num" w:pos="2160"/>
+        </w:tabs>
+        <w:ind w:left="2160" w:hanging="360"/>
+      </w:pPr>
+      <w:rPr>
+        <w:rFonts w:ascii="Wingdings" w:hAnsi="Wingdings" w:hint="default"/>
+        <w:sz w:val="20"/>
+      </w:rPr>
+    </w:lvl>
+    <w:lvl w:ilvl="3" w:tentative="1">
+      <w:start w:val="1"/>
+      <w:numFmt w:val="bullet"/>
+      <w:lvlText w:val=""/>
+      <w:lvlJc w:val="left"/>
+      <w:pPr>
+        <w:tabs>
+          <w:tab w:val="num" w:pos="2880"/>
+        </w:tabs>
+        <w:ind w:left="2880" w:hanging="360"/>
+      </w:pPr>
+      <w:rPr>
+        <w:rFonts w:ascii="Wingdings" w:hAnsi="Wingdings" w:hint="default"/>
+        <w:sz w:val="20"/>
+      </w:rPr>
+    </w:lvl>
+    <w:lvl w:ilvl="4" w:tentative="1">
+      <w:start w:val="1"/>
+      <w:numFmt w:val="bullet"/>
+      <w:lvlText w:val=""/>
+      <w:lvlJc w:val="left"/>
+      <w:pPr>
+        <w:tabs>
+          <w:tab w:val="num" w:pos="3600"/>
+        </w:tabs>
+        <w:ind w:left="3600" w:hanging="360"/>
+      </w:pPr>
+      <w:rPr>
+        <w:rFonts w:ascii="Wingdings" w:hAnsi="Wingdings" w:hint="default"/>
+        <w:sz w:val="20"/>
+      </w:rPr>
+    </w:lvl>
+    <w:lvl w:ilvl="5" w:tentative="1">
+      <w:start w:val="1"/>
+      <w:numFmt w:val="bullet"/>
+      <w:lvlText w:val=""/>
+      <w:lvlJc w:val="left"/>
+      <w:pPr>
+        <w:tabs>
+          <w:tab w:val="num" w:pos="4320"/>
+        </w:tabs>
+        <w:ind w:left="4320" w:hanging="360"/>
+      </w:pPr>
+      <w:rPr>
+        <w:rFonts w:ascii="Wingdings" w:hAnsi="Wingdings" w:hint="default"/>
+        <w:sz w:val="20"/>
+      </w:rPr>
+    </w:lvl>
+    <w:lvl w:ilvl="6" w:tentative="1">
+      <w:start w:val="1"/>
+      <w:numFmt w:val="bullet"/>
+      <w:lvlText w:val=""/>
+      <w:lvlJc w:val="left"/>
+      <w:pPr>
+        <w:tabs>
+          <w:tab w:val="num" w:pos="5040"/>
+        </w:tabs>
+        <w:ind w:left="5040" w:hanging="360"/>
+      </w:pPr>
+      <w:rPr>
+        <w:rFonts w:ascii="Wingdings" w:hAnsi="Wingdings" w:hint="default"/>
+        <w:sz w:val="20"/>
+      </w:rPr>
+    </w:lvl>
+    <w:lvl w:ilvl="7" w:tentative="1">
+      <w:start w:val="1"/>
+      <w:numFmt w:val="bullet"/>
+      <w:lvlText w:val=""/>
+      <w:lvlJc w:val="left"/>
+      <w:pPr>
+        <w:tabs>
+          <w:tab w:val="num" w:pos="5760"/>
+        </w:tabs>
+        <w:ind w:left="5760" w:hanging="360"/>
+      </w:pPr>
+      <w:rPr>
+        <w:rFonts w:ascii="Wingdings" w:hAnsi="Wingdings" w:hint="default"/>
+        <w:sz w:val="20"/>
+      </w:rPr>
+    </w:lvl>
+    <w:lvl w:ilvl="8" w:tentative="1">
+      <w:start w:val="1"/>
+      <w:numFmt w:val="bullet"/>
+      <w:lvlText w:val=""/>
+      <w:lvlJc w:val="left"/>
+      <w:pPr>
+        <w:tabs>
+          <w:tab w:val="num" w:pos="6480"/>
+        </w:tabs>
+        <w:ind w:left="6480" w:hanging="360"/>
+      </w:pPr>
+      <w:rPr>
+        <w:rFonts w:ascii="Wingdings" w:hAnsi="Wingdings" w:hint="default"/>
+        <w:sz w:val="20"/>
+      </w:rPr>
+    </w:lvl>
+  </w:abstractNum>
+  <w:abstractNum w:abstractNumId="60" w15:restartNumberingAfterBreak="0">
     <w:nsid w:val="54075CFD"/>
     <w:multiLevelType w:val="multilevel"/>
     <w:tmpl w:val="3AC4BCAA"/>
@@ -9095,7 +9890,7 @@
       </w:rPr>
     </w:lvl>
   </w:abstractNum>
-  <w:abstractNum w:abstractNumId="59" w15:restartNumberingAfterBreak="0">
+  <w:abstractNum w:abstractNumId="61" w15:restartNumberingAfterBreak="0">
     <w:nsid w:val="556677F7"/>
     <w:multiLevelType w:val="hybridMultilevel"/>
     <w:tmpl w:val="0452FA92"/>
@@ -9208,7 +10003,7 @@
       </w:rPr>
     </w:lvl>
   </w:abstractNum>
-  <w:abstractNum w:abstractNumId="60" w15:restartNumberingAfterBreak="0">
+  <w:abstractNum w:abstractNumId="62" w15:restartNumberingAfterBreak="0">
     <w:nsid w:val="55C65063"/>
     <w:multiLevelType w:val="hybridMultilevel"/>
     <w:tmpl w:val="3CE0E434"/>
@@ -9299,7 +10094,7 @@
       </w:pPr>
     </w:lvl>
   </w:abstractNum>
-  <w:abstractNum w:abstractNumId="61" w15:restartNumberingAfterBreak="0">
+  <w:abstractNum w:abstractNumId="63" w15:restartNumberingAfterBreak="0">
     <w:nsid w:val="59857ACC"/>
     <w:multiLevelType w:val="hybridMultilevel"/>
     <w:tmpl w:val="3CE0E434"/>
@@ -9390,7 +10185,7 @@
       </w:pPr>
     </w:lvl>
   </w:abstractNum>
-  <w:abstractNum w:abstractNumId="62" w15:restartNumberingAfterBreak="0">
+  <w:abstractNum w:abstractNumId="64" w15:restartNumberingAfterBreak="0">
     <w:nsid w:val="599A3511"/>
     <w:multiLevelType w:val="multilevel"/>
     <w:tmpl w:val="2BA6E40E"/>
@@ -9503,7 +10298,7 @@
       </w:pPr>
     </w:lvl>
   </w:abstractNum>
-  <w:abstractNum w:abstractNumId="63" w15:restartNumberingAfterBreak="0">
+  <w:abstractNum w:abstractNumId="65" w15:restartNumberingAfterBreak="0">
     <w:nsid w:val="5A3F5D35"/>
     <w:multiLevelType w:val="multilevel"/>
     <w:tmpl w:val="7EF608A6"/>
@@ -9624,7 +10419,7 @@
       </w:rPr>
     </w:lvl>
   </w:abstractNum>
-  <w:abstractNum w:abstractNumId="64" w15:restartNumberingAfterBreak="0">
+  <w:abstractNum w:abstractNumId="66" w15:restartNumberingAfterBreak="0">
     <w:nsid w:val="5ADE483D"/>
     <w:multiLevelType w:val="hybridMultilevel"/>
     <w:tmpl w:val="01BE57D2"/>
@@ -9737,7 +10532,7 @@
       </w:rPr>
     </w:lvl>
   </w:abstractNum>
-  <w:abstractNum w:abstractNumId="65" w15:restartNumberingAfterBreak="0">
+  <w:abstractNum w:abstractNumId="67" w15:restartNumberingAfterBreak="0">
     <w:nsid w:val="5E5120B3"/>
     <w:multiLevelType w:val="multilevel"/>
     <w:tmpl w:val="67A21160"/>
@@ -9850,7 +10645,7 @@
       </w:pPr>
     </w:lvl>
   </w:abstractNum>
-  <w:abstractNum w:abstractNumId="66" w15:restartNumberingAfterBreak="0">
+  <w:abstractNum w:abstractNumId="68" w15:restartNumberingAfterBreak="0">
     <w:nsid w:val="5F6443CB"/>
     <w:multiLevelType w:val="hybridMultilevel"/>
     <w:tmpl w:val="13644E7E"/>
@@ -9963,7 +10758,7 @@
       </w:rPr>
     </w:lvl>
   </w:abstractNum>
-  <w:abstractNum w:abstractNumId="67" w15:restartNumberingAfterBreak="0">
+  <w:abstractNum w:abstractNumId="69" w15:restartNumberingAfterBreak="0">
     <w:nsid w:val="5F6A20B7"/>
     <w:multiLevelType w:val="hybridMultilevel"/>
     <w:tmpl w:val="3CE0E434"/>
@@ -10054,7 +10849,7 @@
       </w:pPr>
     </w:lvl>
   </w:abstractNum>
-  <w:abstractNum w:abstractNumId="68" w15:restartNumberingAfterBreak="0">
+  <w:abstractNum w:abstractNumId="70" w15:restartNumberingAfterBreak="0">
     <w:nsid w:val="600B518D"/>
     <w:multiLevelType w:val="multilevel"/>
     <w:tmpl w:val="98126300"/>
@@ -10167,7 +10962,7 @@
       </w:pPr>
     </w:lvl>
   </w:abstractNum>
-  <w:abstractNum w:abstractNumId="69" w15:restartNumberingAfterBreak="0">
+  <w:abstractNum w:abstractNumId="71" w15:restartNumberingAfterBreak="0">
     <w:nsid w:val="60AB445C"/>
     <w:multiLevelType w:val="hybridMultilevel"/>
     <w:tmpl w:val="5B205EEC"/>
@@ -10280,7 +11075,7 @@
       </w:rPr>
     </w:lvl>
   </w:abstractNum>
-  <w:abstractNum w:abstractNumId="70" w15:restartNumberingAfterBreak="0">
+  <w:abstractNum w:abstractNumId="72" w15:restartNumberingAfterBreak="0">
     <w:nsid w:val="623B312B"/>
     <w:multiLevelType w:val="multilevel"/>
     <w:tmpl w:val="7EF608A6"/>
@@ -10401,7 +11196,7 @@
       </w:rPr>
     </w:lvl>
   </w:abstractNum>
-  <w:abstractNum w:abstractNumId="71" w15:restartNumberingAfterBreak="0">
+  <w:abstractNum w:abstractNumId="73" w15:restartNumberingAfterBreak="0">
     <w:nsid w:val="657B79B0"/>
     <w:multiLevelType w:val="hybridMultilevel"/>
     <w:tmpl w:val="41107562"/>
@@ -10514,7 +11309,7 @@
       </w:rPr>
     </w:lvl>
   </w:abstractNum>
-  <w:abstractNum w:abstractNumId="72" w15:restartNumberingAfterBreak="0">
+  <w:abstractNum w:abstractNumId="74" w15:restartNumberingAfterBreak="0">
     <w:nsid w:val="683F1105"/>
     <w:multiLevelType w:val="hybridMultilevel"/>
     <w:tmpl w:val="51BC08C2"/>
@@ -10627,7 +11422,7 @@
       </w:rPr>
     </w:lvl>
   </w:abstractNum>
-  <w:abstractNum w:abstractNumId="73" w15:restartNumberingAfterBreak="0">
+  <w:abstractNum w:abstractNumId="75" w15:restartNumberingAfterBreak="0">
     <w:nsid w:val="686A6E66"/>
     <w:multiLevelType w:val="hybridMultilevel"/>
     <w:tmpl w:val="3CE0E434"/>
@@ -10718,7 +11513,7 @@
       </w:pPr>
     </w:lvl>
   </w:abstractNum>
-  <w:abstractNum w:abstractNumId="74" w15:restartNumberingAfterBreak="0">
+  <w:abstractNum w:abstractNumId="76" w15:restartNumberingAfterBreak="0">
     <w:nsid w:val="688B64FD"/>
     <w:multiLevelType w:val="hybridMultilevel"/>
     <w:tmpl w:val="29702170"/>
@@ -10831,7 +11626,7 @@
       </w:rPr>
     </w:lvl>
   </w:abstractNum>
-  <w:abstractNum w:abstractNumId="75" w15:restartNumberingAfterBreak="0">
+  <w:abstractNum w:abstractNumId="77" w15:restartNumberingAfterBreak="0">
     <w:nsid w:val="68DF6E80"/>
     <w:multiLevelType w:val="hybridMultilevel"/>
     <w:tmpl w:val="60F29FC2"/>
@@ -10944,7 +11739,7 @@
       </w:rPr>
     </w:lvl>
   </w:abstractNum>
-  <w:abstractNum w:abstractNumId="76" w15:restartNumberingAfterBreak="0">
+  <w:abstractNum w:abstractNumId="78" w15:restartNumberingAfterBreak="0">
     <w:nsid w:val="698C7F5E"/>
     <w:multiLevelType w:val="hybridMultilevel"/>
     <w:tmpl w:val="0A7A4D94"/>
@@ -11030,7 +11825,7 @@
       </w:pPr>
     </w:lvl>
   </w:abstractNum>
-  <w:abstractNum w:abstractNumId="77" w15:restartNumberingAfterBreak="0">
+  <w:abstractNum w:abstractNumId="79" w15:restartNumberingAfterBreak="0">
     <w:nsid w:val="6A737B9D"/>
     <w:multiLevelType w:val="hybridMultilevel"/>
     <w:tmpl w:val="F13E5E10"/>
@@ -11119,7 +11914,7 @@
       </w:pPr>
     </w:lvl>
   </w:abstractNum>
-  <w:abstractNum w:abstractNumId="78" w15:restartNumberingAfterBreak="0">
+  <w:abstractNum w:abstractNumId="80" w15:restartNumberingAfterBreak="0">
     <w:nsid w:val="6A917BF2"/>
     <w:multiLevelType w:val="hybridMultilevel"/>
     <w:tmpl w:val="3CE0E434"/>
@@ -11210,7 +12005,7 @@
       </w:pPr>
     </w:lvl>
   </w:abstractNum>
-  <w:abstractNum w:abstractNumId="79" w15:restartNumberingAfterBreak="0">
+  <w:abstractNum w:abstractNumId="81" w15:restartNumberingAfterBreak="0">
     <w:nsid w:val="6D7625DD"/>
     <w:multiLevelType w:val="hybridMultilevel"/>
     <w:tmpl w:val="3CE0E434"/>
@@ -11301,7 +12096,7 @@
       </w:pPr>
     </w:lvl>
   </w:abstractNum>
-  <w:abstractNum w:abstractNumId="80" w15:restartNumberingAfterBreak="0">
+  <w:abstractNum w:abstractNumId="82" w15:restartNumberingAfterBreak="0">
     <w:nsid w:val="6DD83E0F"/>
     <w:multiLevelType w:val="hybridMultilevel"/>
     <w:tmpl w:val="2BC8089E"/>
@@ -11414,7 +12209,7 @@
       </w:rPr>
     </w:lvl>
   </w:abstractNum>
-  <w:abstractNum w:abstractNumId="81" w15:restartNumberingAfterBreak="0">
+  <w:abstractNum w:abstractNumId="83" w15:restartNumberingAfterBreak="0">
     <w:nsid w:val="6FA3035E"/>
     <w:multiLevelType w:val="hybridMultilevel"/>
     <w:tmpl w:val="3CE0E434"/>
@@ -11505,7 +12300,7 @@
       </w:pPr>
     </w:lvl>
   </w:abstractNum>
-  <w:abstractNum w:abstractNumId="82" w15:restartNumberingAfterBreak="0">
+  <w:abstractNum w:abstractNumId="84" w15:restartNumberingAfterBreak="0">
     <w:nsid w:val="6FFE3BB4"/>
     <w:multiLevelType w:val="hybridMultilevel"/>
     <w:tmpl w:val="3CE0E434"/>
@@ -11596,7 +12391,7 @@
       </w:pPr>
     </w:lvl>
   </w:abstractNum>
-  <w:abstractNum w:abstractNumId="83" w15:restartNumberingAfterBreak="0">
+  <w:abstractNum w:abstractNumId="85" w15:restartNumberingAfterBreak="0">
     <w:nsid w:val="70067063"/>
     <w:multiLevelType w:val="multilevel"/>
     <w:tmpl w:val="9AA42D06"/>
@@ -11709,7 +12504,7 @@
       </w:pPr>
     </w:lvl>
   </w:abstractNum>
-  <w:abstractNum w:abstractNumId="84" w15:restartNumberingAfterBreak="0">
+  <w:abstractNum w:abstractNumId="86" w15:restartNumberingAfterBreak="0">
     <w:nsid w:val="72F61604"/>
     <w:multiLevelType w:val="multilevel"/>
     <w:tmpl w:val="900A76BA"/>
@@ -11822,7 +12617,7 @@
       </w:pPr>
     </w:lvl>
   </w:abstractNum>
-  <w:abstractNum w:abstractNumId="85" w15:restartNumberingAfterBreak="0">
+  <w:abstractNum w:abstractNumId="87" w15:restartNumberingAfterBreak="0">
     <w:nsid w:val="74645ED4"/>
     <w:multiLevelType w:val="hybridMultilevel"/>
     <w:tmpl w:val="47FC0B7A"/>
@@ -11911,7 +12706,7 @@
       </w:pPr>
     </w:lvl>
   </w:abstractNum>
-  <w:abstractNum w:abstractNumId="86" w15:restartNumberingAfterBreak="0">
+  <w:abstractNum w:abstractNumId="88" w15:restartNumberingAfterBreak="0">
     <w:nsid w:val="75C6060A"/>
     <w:multiLevelType w:val="hybridMultilevel"/>
     <w:tmpl w:val="3CE0E434"/>
@@ -12002,7 +12797,7 @@
       </w:pPr>
     </w:lvl>
   </w:abstractNum>
-  <w:abstractNum w:abstractNumId="87" w15:restartNumberingAfterBreak="0">
+  <w:abstractNum w:abstractNumId="89" w15:restartNumberingAfterBreak="0">
     <w:nsid w:val="78EC3C08"/>
     <w:multiLevelType w:val="multilevel"/>
     <w:tmpl w:val="5D7A6698"/>
@@ -12108,7 +12903,7 @@
       </w:pPr>
     </w:lvl>
   </w:abstractNum>
-  <w:abstractNum w:abstractNumId="88" w15:restartNumberingAfterBreak="0">
+  <w:abstractNum w:abstractNumId="90" w15:restartNumberingAfterBreak="0">
     <w:nsid w:val="79201FEA"/>
     <w:multiLevelType w:val="hybridMultilevel"/>
     <w:tmpl w:val="3CE0E434"/>
@@ -12199,7 +12994,7 @@
       </w:pPr>
     </w:lvl>
   </w:abstractNum>
-  <w:abstractNum w:abstractNumId="89" w15:restartNumberingAfterBreak="0">
+  <w:abstractNum w:abstractNumId="91" w15:restartNumberingAfterBreak="0">
     <w:nsid w:val="79D814F9"/>
     <w:multiLevelType w:val="multilevel"/>
     <w:tmpl w:val="70A27B1E"/>
@@ -12348,7 +13143,7 @@
       </w:rPr>
     </w:lvl>
   </w:abstractNum>
-  <w:abstractNum w:abstractNumId="90" w15:restartNumberingAfterBreak="0">
+  <w:abstractNum w:abstractNumId="92" w15:restartNumberingAfterBreak="0">
     <w:nsid w:val="7AAF6034"/>
     <w:multiLevelType w:val="multilevel"/>
     <w:tmpl w:val="F746DA02"/>
@@ -12461,7 +13256,7 @@
       </w:pPr>
     </w:lvl>
   </w:abstractNum>
-  <w:abstractNum w:abstractNumId="91" w15:restartNumberingAfterBreak="0">
+  <w:abstractNum w:abstractNumId="93" w15:restartNumberingAfterBreak="0">
     <w:nsid w:val="7B4718BF"/>
     <w:multiLevelType w:val="hybridMultilevel"/>
     <w:tmpl w:val="3CE0E434"/>
@@ -12552,7 +13347,7 @@
       </w:pPr>
     </w:lvl>
   </w:abstractNum>
-  <w:abstractNum w:abstractNumId="92" w15:restartNumberingAfterBreak="0">
+  <w:abstractNum w:abstractNumId="94" w15:restartNumberingAfterBreak="0">
     <w:nsid w:val="7BB406FF"/>
     <w:multiLevelType w:val="hybridMultilevel"/>
     <w:tmpl w:val="3CE0E434"/>
@@ -12650,25 +13445,25 @@
     <w:abstractNumId w:val="33"/>
   </w:num>
   <w:num w:numId="3" w16cid:durableId="135223426">
-    <w:abstractNumId w:val="75"/>
+    <w:abstractNumId w:val="77"/>
   </w:num>
   <w:num w:numId="4" w16cid:durableId="1574004701">
-    <w:abstractNumId w:val="79"/>
+    <w:abstractNumId w:val="81"/>
   </w:num>
   <w:num w:numId="5" w16cid:durableId="1039862054">
     <w:abstractNumId w:val="22"/>
   </w:num>
   <w:num w:numId="6" w16cid:durableId="662587344">
-    <w:abstractNumId w:val="92"/>
+    <w:abstractNumId w:val="94"/>
   </w:num>
   <w:num w:numId="7" w16cid:durableId="682978374">
     <w:abstractNumId w:val="10"/>
   </w:num>
   <w:num w:numId="8" w16cid:durableId="547226891">
-    <w:abstractNumId w:val="60"/>
+    <w:abstractNumId w:val="62"/>
   </w:num>
   <w:num w:numId="9" w16cid:durableId="1837067978">
-    <w:abstractNumId w:val="86"/>
+    <w:abstractNumId w:val="88"/>
   </w:num>
   <w:num w:numId="10" w16cid:durableId="1054431885">
     <w:abstractNumId w:val="39"/>
@@ -12683,19 +13478,19 @@
     <w:abstractNumId w:val="21"/>
   </w:num>
   <w:num w:numId="14" w16cid:durableId="285620234">
-    <w:abstractNumId w:val="91"/>
+    <w:abstractNumId w:val="93"/>
   </w:num>
   <w:num w:numId="15" w16cid:durableId="1748645538">
-    <w:abstractNumId w:val="49"/>
+    <w:abstractNumId w:val="50"/>
   </w:num>
   <w:num w:numId="16" w16cid:durableId="610824784">
     <w:abstractNumId w:val="17"/>
   </w:num>
   <w:num w:numId="17" w16cid:durableId="382562386">
-    <w:abstractNumId w:val="82"/>
+    <w:abstractNumId w:val="84"/>
   </w:num>
   <w:num w:numId="18" w16cid:durableId="474179740">
-    <w:abstractNumId w:val="73"/>
+    <w:abstractNumId w:val="75"/>
   </w:num>
   <w:num w:numId="19" w16cid:durableId="785394232">
     <w:abstractNumId w:val="35"/>
@@ -12707,34 +13502,34 @@
     <w:abstractNumId w:val="11"/>
   </w:num>
   <w:num w:numId="22" w16cid:durableId="1662655096">
-    <w:abstractNumId w:val="44"/>
+    <w:abstractNumId w:val="45"/>
   </w:num>
   <w:num w:numId="23" w16cid:durableId="1177768595">
-    <w:abstractNumId w:val="67"/>
+    <w:abstractNumId w:val="69"/>
   </w:num>
   <w:num w:numId="24" w16cid:durableId="1422025502">
     <w:abstractNumId w:val="32"/>
   </w:num>
   <w:num w:numId="25" w16cid:durableId="1255288017">
-    <w:abstractNumId w:val="78"/>
+    <w:abstractNumId w:val="80"/>
   </w:num>
   <w:num w:numId="26" w16cid:durableId="783352810">
     <w:abstractNumId w:val="29"/>
   </w:num>
   <w:num w:numId="27" w16cid:durableId="1302342887">
-    <w:abstractNumId w:val="81"/>
+    <w:abstractNumId w:val="83"/>
   </w:num>
   <w:num w:numId="28" w16cid:durableId="1055548647">
-    <w:abstractNumId w:val="61"/>
+    <w:abstractNumId w:val="63"/>
   </w:num>
   <w:num w:numId="29" w16cid:durableId="2081555553">
-    <w:abstractNumId w:val="88"/>
+    <w:abstractNumId w:val="90"/>
   </w:num>
   <w:num w:numId="30" w16cid:durableId="589243998">
     <w:abstractNumId w:val="13"/>
   </w:num>
   <w:num w:numId="31" w16cid:durableId="1972514018">
-    <w:abstractNumId w:val="55"/>
+    <w:abstractNumId w:val="56"/>
   </w:num>
   <w:num w:numId="32" w16cid:durableId="581257420">
     <w:abstractNumId w:val="41"/>
@@ -12749,16 +13544,16 @@
     <w:abstractNumId w:val="20"/>
   </w:num>
   <w:num w:numId="36" w16cid:durableId="905146838">
-    <w:abstractNumId w:val="80"/>
+    <w:abstractNumId w:val="82"/>
   </w:num>
   <w:num w:numId="37" w16cid:durableId="546718641">
     <w:abstractNumId w:val="25"/>
   </w:num>
   <w:num w:numId="38" w16cid:durableId="501940315">
-    <w:abstractNumId w:val="66"/>
+    <w:abstractNumId w:val="68"/>
   </w:num>
   <w:num w:numId="39" w16cid:durableId="403841821">
-    <w:abstractNumId w:val="45"/>
+    <w:abstractNumId w:val="46"/>
   </w:num>
   <w:num w:numId="40" w16cid:durableId="204217226">
     <w:abstractNumId w:val="34"/>
@@ -12770,16 +13565,16 @@
     <w:abstractNumId w:val="5"/>
   </w:num>
   <w:num w:numId="43" w16cid:durableId="1311866374">
-    <w:abstractNumId w:val="89"/>
+    <w:abstractNumId w:val="91"/>
   </w:num>
   <w:num w:numId="44" w16cid:durableId="660885854">
-    <w:abstractNumId w:val="48"/>
+    <w:abstractNumId w:val="49"/>
   </w:num>
   <w:num w:numId="45" w16cid:durableId="1675231510">
-    <w:abstractNumId w:val="83"/>
+    <w:abstractNumId w:val="85"/>
   </w:num>
   <w:num w:numId="46" w16cid:durableId="1737699488">
-    <w:abstractNumId w:val="65"/>
+    <w:abstractNumId w:val="67"/>
     <w:lvlOverride w:ilvl="0">
       <w:lvl w:ilvl="0">
         <w:numFmt w:val="decimal"/>
@@ -12792,16 +13587,16 @@
     <w:abstractNumId w:val="2"/>
   </w:num>
   <w:num w:numId="48" w16cid:durableId="17171648">
-    <w:abstractNumId w:val="74"/>
+    <w:abstractNumId w:val="76"/>
   </w:num>
   <w:num w:numId="49" w16cid:durableId="772633049">
-    <w:abstractNumId w:val="68"/>
+    <w:abstractNumId w:val="70"/>
   </w:num>
   <w:num w:numId="50" w16cid:durableId="725955918">
-    <w:abstractNumId w:val="84"/>
+    <w:abstractNumId w:val="86"/>
   </w:num>
   <w:num w:numId="51" w16cid:durableId="1680503989">
-    <w:abstractNumId w:val="84"/>
+    <w:abstractNumId w:val="86"/>
     <w:lvlOverride w:ilvl="0">
       <w:lvl w:ilvl="0">
         <w:numFmt w:val="decimal"/>
@@ -12811,7 +13606,7 @@
     </w:lvlOverride>
   </w:num>
   <w:num w:numId="52" w16cid:durableId="518591359">
-    <w:abstractNumId w:val="50"/>
+    <w:abstractNumId w:val="51"/>
     <w:lvlOverride w:ilvl="0">
       <w:lvl w:ilvl="0">
         <w:numFmt w:val="decimal"/>
@@ -12821,7 +13616,7 @@
     </w:lvlOverride>
   </w:num>
   <w:num w:numId="53" w16cid:durableId="1195655273">
-    <w:abstractNumId w:val="46"/>
+    <w:abstractNumId w:val="47"/>
     <w:lvlOverride w:ilvl="0">
       <w:lvl w:ilvl="0">
         <w:numFmt w:val="decimal"/>
@@ -12831,7 +13626,7 @@
     </w:lvlOverride>
   </w:num>
   <w:num w:numId="54" w16cid:durableId="1353805555">
-    <w:abstractNumId w:val="62"/>
+    <w:abstractNumId w:val="64"/>
   </w:num>
   <w:num w:numId="55" w16cid:durableId="473789750">
     <w:abstractNumId w:val="28"/>
@@ -12857,22 +13652,22 @@
     <w:abstractNumId w:val="37"/>
   </w:num>
   <w:num w:numId="58" w16cid:durableId="320432017">
-    <w:abstractNumId w:val="71"/>
+    <w:abstractNumId w:val="73"/>
   </w:num>
   <w:num w:numId="59" w16cid:durableId="1437825401">
-    <w:abstractNumId w:val="77"/>
+    <w:abstractNumId w:val="79"/>
   </w:num>
   <w:num w:numId="60" w16cid:durableId="351759628">
     <w:abstractNumId w:val="36"/>
   </w:num>
   <w:num w:numId="61" w16cid:durableId="1120536897">
-    <w:abstractNumId w:val="85"/>
+    <w:abstractNumId w:val="87"/>
   </w:num>
   <w:num w:numId="62" w16cid:durableId="1784425250">
-    <w:abstractNumId w:val="70"/>
+    <w:abstractNumId w:val="72"/>
   </w:num>
   <w:num w:numId="63" w16cid:durableId="2107579399">
-    <w:abstractNumId w:val="87"/>
+    <w:abstractNumId w:val="89"/>
   </w:num>
   <w:num w:numId="64" w16cid:durableId="1336035154">
     <w:abstractNumId w:val="27"/>
@@ -12881,19 +13676,19 @@
     <w:abstractNumId w:val="16"/>
   </w:num>
   <w:num w:numId="66" w16cid:durableId="633826675">
-    <w:abstractNumId w:val="72"/>
+    <w:abstractNumId w:val="74"/>
   </w:num>
   <w:num w:numId="67" w16cid:durableId="1287657930">
     <w:abstractNumId w:val="23"/>
   </w:num>
   <w:num w:numId="68" w16cid:durableId="865364173">
-    <w:abstractNumId w:val="64"/>
+    <w:abstractNumId w:val="66"/>
   </w:num>
   <w:num w:numId="69" w16cid:durableId="437530404">
-    <w:abstractNumId w:val="52"/>
+    <w:abstractNumId w:val="53"/>
   </w:num>
   <w:num w:numId="70" w16cid:durableId="1332684657">
-    <w:abstractNumId w:val="47"/>
+    <w:abstractNumId w:val="48"/>
     <w:lvlOverride w:ilvl="0">
       <w:lvl w:ilvl="0">
         <w:numFmt w:val="decimal"/>
@@ -12903,10 +13698,10 @@
     </w:lvlOverride>
   </w:num>
   <w:num w:numId="71" w16cid:durableId="118182967">
-    <w:abstractNumId w:val="90"/>
+    <w:abstractNumId w:val="92"/>
   </w:num>
   <w:num w:numId="72" w16cid:durableId="1049574425">
-    <w:abstractNumId w:val="90"/>
+    <w:abstractNumId w:val="92"/>
     <w:lvlOverride w:ilvl="0">
       <w:lvl w:ilvl="0">
         <w:numFmt w:val="decimal"/>
@@ -12929,10 +13724,10 @@
     </w:lvlOverride>
   </w:num>
   <w:num w:numId="75" w16cid:durableId="681930253">
-    <w:abstractNumId w:val="58"/>
+    <w:abstractNumId w:val="60"/>
   </w:num>
   <w:num w:numId="76" w16cid:durableId="1756785602">
-    <w:abstractNumId w:val="51"/>
+    <w:abstractNumId w:val="52"/>
     <w:lvlOverride w:ilvl="0">
       <w:lvl w:ilvl="0">
         <w:numFmt w:val="decimal"/>
@@ -12942,7 +13737,7 @@
     </w:lvlOverride>
   </w:num>
   <w:num w:numId="77" w16cid:durableId="1583416818">
-    <w:abstractNumId w:val="56"/>
+    <w:abstractNumId w:val="57"/>
     <w:lvlOverride w:ilvl="0">
       <w:lvl w:ilvl="0">
         <w:numFmt w:val="decimal"/>
@@ -12992,7 +13787,7 @@
     </w:lvlOverride>
   </w:num>
   <w:num w:numId="82" w16cid:durableId="378943093">
-    <w:abstractNumId w:val="53"/>
+    <w:abstractNumId w:val="54"/>
     <w:lvlOverride w:ilvl="0">
       <w:lvl w:ilvl="0">
         <w:numFmt w:val="decimal"/>
@@ -13005,10 +13800,10 @@
     <w:abstractNumId w:val="40"/>
   </w:num>
   <w:num w:numId="84" w16cid:durableId="1227914454">
-    <w:abstractNumId w:val="69"/>
+    <w:abstractNumId w:val="71"/>
   </w:num>
   <w:num w:numId="85" w16cid:durableId="530384528">
-    <w:abstractNumId w:val="76"/>
+    <w:abstractNumId w:val="78"/>
   </w:num>
   <w:num w:numId="86" w16cid:durableId="176047904">
     <w:abstractNumId w:val="15"/>
@@ -13017,13 +13812,13 @@
     <w:abstractNumId w:val="30"/>
   </w:num>
   <w:num w:numId="88" w16cid:durableId="977416030">
-    <w:abstractNumId w:val="63"/>
+    <w:abstractNumId w:val="65"/>
   </w:num>
   <w:num w:numId="89" w16cid:durableId="1155877190">
-    <w:abstractNumId w:val="54"/>
+    <w:abstractNumId w:val="55"/>
   </w:num>
   <w:num w:numId="90" w16cid:durableId="1104838272">
-    <w:abstractNumId w:val="59"/>
+    <w:abstractNumId w:val="61"/>
   </w:num>
   <w:num w:numId="91" w16cid:durableId="265776366">
     <w:abstractNumId w:val="33"/>
@@ -13050,10 +13845,16 @@
     <w:abstractNumId w:val="9"/>
   </w:num>
   <w:num w:numId="99" w16cid:durableId="684555325">
-    <w:abstractNumId w:val="57"/>
+    <w:abstractNumId w:val="58"/>
   </w:num>
   <w:num w:numId="100" w16cid:durableId="142507249">
     <w:abstractNumId w:val="7"/>
+  </w:num>
+  <w:num w:numId="101" w16cid:durableId="2059666443">
+    <w:abstractNumId w:val="59"/>
+  </w:num>
+  <w:num w:numId="102" w16cid:durableId="2000230212">
+    <w:abstractNumId w:val="44"/>
   </w:num>
   <w:numIdMacAtCleanup w:val="42"/>
 </w:numbering>

</xml_diff>

<commit_message>
add sequence and GUI implemetation and screenshots sections to the report
</commit_message>
<xml_diff>
--- a/docs/deliverables/3.1/Deliverable 3-1 Design and GUI- Submission - Submission.docx
+++ b/docs/deliverables/3.1/Deliverable 3-1 Design and GUI- Submission - Submission.docx
@@ -5430,6 +5430,717 @@
       <w:bookmarkEnd w:id="31"/>
     </w:p>
     <w:p>
+      <w:r>
+        <w:t xml:space="preserve">This section presents the initial JavaFX GUI implementation of </w:t>
+      </w:r>
+      <w:proofErr w:type="spellStart"/>
+      <w:r>
+        <w:t>SmartBudget</w:t>
+      </w:r>
+      <w:proofErr w:type="spellEnd"/>
+      <w:r>
+        <w:t xml:space="preserve">. The goal of the GUI in this iteration is to demonstrate the main user workflows through a clear interface and consistent navigation. The GUI is organized into three primary areas: </w:t>
+      </w:r>
+      <w:r>
+        <w:rPr>
+          <w:b/>
+          <w:bCs/>
+        </w:rPr>
+        <w:t>Transactions</w:t>
+      </w:r>
+      <w:r>
+        <w:t xml:space="preserve">, </w:t>
+      </w:r>
+      <w:r>
+        <w:rPr>
+          <w:b/>
+          <w:bCs/>
+        </w:rPr>
+        <w:t>Budgets</w:t>
+      </w:r>
+      <w:r>
+        <w:t xml:space="preserve">, and </w:t>
+      </w:r>
+      <w:r>
+        <w:rPr>
+          <w:b/>
+          <w:bCs/>
+        </w:rPr>
+        <w:t>Reports</w:t>
+      </w:r>
+      <w:r>
+        <w:t>. Each screen is connected to the service layer through controllers so that user actions (such as adding a transaction or setting a budget) immediately update what is shown on the screen. The screenshots in the subsections below provide evidence of the implemented pages and dialogs, and they show how the user can move through the system to complete the main tasks.</w:t>
+      </w:r>
+    </w:p>
+    <w:p>
+      <w:pPr>
+        <w:pStyle w:val="Heading2"/>
+      </w:pPr>
+      <w:r>
+        <w:lastRenderedPageBreak/>
+        <w:t>UI Structure and Navigation</w:t>
+      </w:r>
+    </w:p>
+    <w:p>
+      <w:r>
+        <w:t xml:space="preserve">The </w:t>
+      </w:r>
+      <w:proofErr w:type="spellStart"/>
+      <w:r>
+        <w:t>SmartBudget</w:t>
+      </w:r>
+      <w:proofErr w:type="spellEnd"/>
+      <w:r>
+        <w:t xml:space="preserve"> interface follows a simple multi-page layout. Users can navigate between the main pages (Transactions, Budgets, Reports) using the application’s navigation controls. Each page focuses on one primary task and uses modal dialogs for create/edit actions to keep the workflow clear and avoid clutter. After the user submits a form (for example, adding a transaction or saving a budget), the system validates the inputs, performs the requested action through the service layer, and refreshes the page with updated data.</w:t>
+      </w:r>
+    </w:p>
+    <w:p>
+      <w:pPr>
+        <w:pStyle w:val="Heading2"/>
+      </w:pPr>
+      <w:r>
+        <w:t>Transactions UI</w:t>
+      </w:r>
+    </w:p>
+    <w:p>
+      <w:pPr>
+        <w:pStyle w:val="Heading3"/>
+      </w:pPr>
+      <w:r>
+        <w:t>Transactions Page</w:t>
+      </w:r>
+    </w:p>
+    <w:p>
+      <w:r>
+        <w:t>The Transactions page is the main workspace for viewing recorded transactions. It displays a list/table of transactions and provides controls for common actions such as adding a new transaction and selecting an existing transaction for editing or deletion. The page is designed to make it easy for users to review their recent activity and manage entries without leaving the Transactions module.</w:t>
+      </w:r>
+    </w:p>
+    <w:p/>
+    <w:p>
+      <w:pPr>
+        <w:rPr>
+          <w:color w:val="EE0000"/>
+          <w:sz w:val="28"/>
+          <w:szCs w:val="24"/>
+          <w:highlight w:val="yellow"/>
+        </w:rPr>
+      </w:pPr>
+      <w:r>
+        <w:rPr>
+          <w:color w:val="EE0000"/>
+          <w:sz w:val="28"/>
+          <w:szCs w:val="24"/>
+          <w:highlight w:val="yellow"/>
+        </w:rPr>
+        <w:t>Insert screenshot: Transactions page</w:t>
+      </w:r>
+    </w:p>
+    <w:p>
+      <w:pPr>
+        <w:rPr>
+          <w:color w:val="EE0000"/>
+          <w:sz w:val="28"/>
+          <w:szCs w:val="24"/>
+          <w:highlight w:val="yellow"/>
+        </w:rPr>
+      </w:pPr>
+    </w:p>
+    <w:p>
+      <w:pPr>
+        <w:rPr>
+          <w:color w:val="EE0000"/>
+          <w:sz w:val="28"/>
+          <w:szCs w:val="24"/>
+        </w:rPr>
+      </w:pPr>
+      <w:r>
+        <w:rPr>
+          <w:color w:val="EE0000"/>
+          <w:sz w:val="28"/>
+          <w:szCs w:val="24"/>
+          <w:highlight w:val="yellow"/>
+        </w:rPr>
+        <w:t>Figure 8.1: Transactions Page (List/Table View)</w:t>
+      </w:r>
+    </w:p>
+    <w:p>
+      <w:pPr>
+        <w:pStyle w:val="Heading3"/>
+      </w:pPr>
+      <w:r>
+        <w:t>Add Transaction Modal</w:t>
+      </w:r>
+    </w:p>
+    <w:p>
+      <w:r>
+        <w:t xml:space="preserve">The Add Transaction modal allows the user to record a new transaction by entering the required details (for example: type, category, amount, date, and an optional note). When the user clicks “Save/Add,” the controller sends the input to the service layer for validation and transaction creation. If the input is valid, the transaction is added and the Transactions page refreshes to show the new entry. If the input is invalid, the modal displays an error </w:t>
+      </w:r>
+      <w:proofErr w:type="gramStart"/>
+      <w:r>
+        <w:t>message</w:t>
+      </w:r>
+      <w:proofErr w:type="gramEnd"/>
+      <w:r>
+        <w:t xml:space="preserve"> and the transaction is not saved.</w:t>
+      </w:r>
+    </w:p>
+    <w:p/>
+    <w:p>
+      <w:pPr>
+        <w:rPr>
+          <w:color w:val="EE0000"/>
+          <w:sz w:val="32"/>
+          <w:szCs w:val="28"/>
+          <w:highlight w:val="yellow"/>
+        </w:rPr>
+      </w:pPr>
+      <w:r>
+        <w:rPr>
+          <w:color w:val="EE0000"/>
+          <w:sz w:val="32"/>
+          <w:szCs w:val="28"/>
+          <w:highlight w:val="yellow"/>
+        </w:rPr>
+        <w:t>Insert screenshot: Add transaction modal</w:t>
+      </w:r>
+    </w:p>
+    <w:p>
+      <w:pPr>
+        <w:rPr>
+          <w:color w:val="EE0000"/>
+          <w:sz w:val="32"/>
+          <w:szCs w:val="28"/>
+          <w:highlight w:val="yellow"/>
+        </w:rPr>
+      </w:pPr>
+    </w:p>
+    <w:p>
+      <w:pPr>
+        <w:rPr>
+          <w:color w:val="EE0000"/>
+          <w:sz w:val="32"/>
+          <w:szCs w:val="28"/>
+        </w:rPr>
+      </w:pPr>
+      <w:r>
+        <w:rPr>
+          <w:color w:val="EE0000"/>
+          <w:sz w:val="32"/>
+          <w:szCs w:val="28"/>
+          <w:highlight w:val="yellow"/>
+        </w:rPr>
+        <w:t>Figure 8.2: Add Transaction Modal</w:t>
+      </w:r>
+    </w:p>
+    <w:p>
+      <w:pPr>
+        <w:pStyle w:val="Heading3"/>
+      </w:pPr>
+      <w:r>
+        <w:lastRenderedPageBreak/>
+        <w:t>Edit Transaction Modal</w:t>
+      </w:r>
+    </w:p>
+    <w:p>
+      <w:r>
+        <w:t>The Edit Transaction modal is used to update an existing transaction. The user selects a transaction from the list and chooses the edit option. The modal opens with the current values pre-filled to reduce user effort and prevent mistakes. Once the user submits changes, the controller validates the updated fields through the service layer and then updates the transaction in the system. The Transactions page refreshes to reflect the updated information.</w:t>
+      </w:r>
+    </w:p>
+    <w:p/>
+    <w:p>
+      <w:pPr>
+        <w:rPr>
+          <w:color w:val="EE0000"/>
+          <w:sz w:val="28"/>
+          <w:szCs w:val="24"/>
+          <w:highlight w:val="yellow"/>
+        </w:rPr>
+      </w:pPr>
+      <w:r>
+        <w:rPr>
+          <w:color w:val="EE0000"/>
+          <w:sz w:val="28"/>
+          <w:szCs w:val="24"/>
+          <w:highlight w:val="yellow"/>
+        </w:rPr>
+        <w:t>Insert screenshot: Edit transaction modal</w:t>
+      </w:r>
+    </w:p>
+    <w:p>
+      <w:pPr>
+        <w:rPr>
+          <w:color w:val="EE0000"/>
+          <w:sz w:val="28"/>
+          <w:szCs w:val="24"/>
+          <w:highlight w:val="yellow"/>
+        </w:rPr>
+      </w:pPr>
+    </w:p>
+    <w:p>
+      <w:pPr>
+        <w:rPr>
+          <w:color w:val="EE0000"/>
+          <w:sz w:val="28"/>
+          <w:szCs w:val="24"/>
+        </w:rPr>
+      </w:pPr>
+      <w:r>
+        <w:rPr>
+          <w:color w:val="EE0000"/>
+          <w:sz w:val="28"/>
+          <w:szCs w:val="24"/>
+          <w:highlight w:val="yellow"/>
+        </w:rPr>
+        <w:t>Figure 8.3: Edit Transaction Modal (Pre-filled Fields)</w:t>
+      </w:r>
+    </w:p>
+    <w:p>
+      <w:pPr>
+        <w:pStyle w:val="Heading3"/>
+      </w:pPr>
+      <w:r>
+        <w:t>Delete Transaction Confirmation</w:t>
+      </w:r>
+    </w:p>
+    <w:p>
+      <w:r>
+        <w:t xml:space="preserve">The Delete Transaction flow is implemented as a confirmation dialog to prevent accidental removals. The user selects a transaction and chooses </w:t>
+      </w:r>
+      <w:proofErr w:type="gramStart"/>
+      <w:r>
+        <w:t>delete</w:t>
+      </w:r>
+      <w:proofErr w:type="gramEnd"/>
+      <w:r>
+        <w:t>. The system prompts the user to confirm the action. If confirmed, the controller calls the service layer to remove the selected transaction, and the Transactions page refreshes so the deleted entry is no longer shown.</w:t>
+      </w:r>
+    </w:p>
+    <w:p/>
+    <w:p>
+      <w:pPr>
+        <w:rPr>
+          <w:color w:val="EE0000"/>
+          <w:sz w:val="28"/>
+          <w:szCs w:val="24"/>
+          <w:highlight w:val="yellow"/>
+        </w:rPr>
+      </w:pPr>
+      <w:r>
+        <w:rPr>
+          <w:color w:val="EE0000"/>
+          <w:sz w:val="28"/>
+          <w:szCs w:val="24"/>
+          <w:highlight w:val="yellow"/>
+        </w:rPr>
+        <w:t>Insert screenshot: Delete confirmation dialog (if available)</w:t>
+      </w:r>
+    </w:p>
+    <w:p>
+      <w:pPr>
+        <w:rPr>
+          <w:color w:val="EE0000"/>
+          <w:sz w:val="28"/>
+          <w:szCs w:val="24"/>
+          <w:highlight w:val="yellow"/>
+        </w:rPr>
+      </w:pPr>
+    </w:p>
+    <w:p>
+      <w:pPr>
+        <w:rPr>
+          <w:color w:val="EE0000"/>
+          <w:sz w:val="28"/>
+          <w:szCs w:val="24"/>
+        </w:rPr>
+      </w:pPr>
+      <w:r>
+        <w:rPr>
+          <w:color w:val="EE0000"/>
+          <w:sz w:val="28"/>
+          <w:szCs w:val="24"/>
+          <w:highlight w:val="yellow"/>
+        </w:rPr>
+        <w:t>Figure 8.4: Delete Transaction Confirmation Dialog</w:t>
+      </w:r>
+    </w:p>
+    <w:p>
+      <w:pPr>
+        <w:pStyle w:val="Heading2"/>
+      </w:pPr>
+      <w:r>
+        <w:t>Budgets UI</w:t>
+      </w:r>
+    </w:p>
+    <w:p>
+      <w:pPr>
+        <w:pStyle w:val="Heading3"/>
+      </w:pPr>
+      <w:r>
+        <w:t>Budgets</w:t>
+      </w:r>
+      <w:r>
+        <w:t xml:space="preserve"> Page</w:t>
+      </w:r>
+    </w:p>
+    <w:p>
+      <w:r>
+        <w:t>The Budgets page allows the user to view and manage monthly budgets by category. The page shows existing budgets (such as category limits) and provides actions to add a new budget or update/delete an existing one. This page supports the budgeting workflow and helps the user compare planned spending (budgets) with actual spending (transactions).</w:t>
+      </w:r>
+    </w:p>
+    <w:p>
+      <w:pPr>
+        <w:rPr>
+          <w:color w:val="EE0000"/>
+          <w:sz w:val="32"/>
+          <w:szCs w:val="28"/>
+          <w:highlight w:val="yellow"/>
+        </w:rPr>
+      </w:pPr>
+      <w:r>
+        <w:rPr>
+          <w:color w:val="EE0000"/>
+          <w:sz w:val="32"/>
+          <w:szCs w:val="28"/>
+          <w:highlight w:val="yellow"/>
+        </w:rPr>
+        <w:t>Insert screenshot: Budgets page</w:t>
+      </w:r>
+    </w:p>
+    <w:p>
+      <w:pPr>
+        <w:rPr>
+          <w:color w:val="EE0000"/>
+          <w:sz w:val="32"/>
+          <w:szCs w:val="28"/>
+          <w:highlight w:val="yellow"/>
+        </w:rPr>
+      </w:pPr>
+    </w:p>
+    <w:p>
+      <w:pPr>
+        <w:rPr>
+          <w:color w:val="EE0000"/>
+          <w:sz w:val="32"/>
+          <w:szCs w:val="28"/>
+        </w:rPr>
+      </w:pPr>
+      <w:r>
+        <w:rPr>
+          <w:color w:val="EE0000"/>
+          <w:sz w:val="32"/>
+          <w:szCs w:val="28"/>
+          <w:highlight w:val="yellow"/>
+        </w:rPr>
+        <w:t>Figure 8.5: Budgets Page</w:t>
+      </w:r>
+    </w:p>
+    <w:p>
+      <w:pPr>
+        <w:pStyle w:val="Heading3"/>
+      </w:pPr>
+      <w:r>
+        <w:lastRenderedPageBreak/>
+        <w:t xml:space="preserve">Add </w:t>
+      </w:r>
+      <w:r>
+        <w:t>Budget</w:t>
+      </w:r>
+      <w:r>
+        <w:t xml:space="preserve"> Modal</w:t>
+      </w:r>
+    </w:p>
+    <w:p>
+      <w:r>
+        <w:t>The Add Budget modal allows the user to create a monthly budget by selecting a category and entering a spending limit for a given month. When submitted, the controller validates the inputs (for example, checking valid numbers and required fields) and then saves the budget through the service layer. If the operation succeeds, the Budgets page refreshes to show the newly created budget.</w:t>
+      </w:r>
+    </w:p>
+    <w:p/>
+    <w:p>
+      <w:pPr>
+        <w:rPr>
+          <w:color w:val="EE0000"/>
+          <w:sz w:val="32"/>
+          <w:szCs w:val="28"/>
+          <w:highlight w:val="yellow"/>
+        </w:rPr>
+      </w:pPr>
+      <w:r>
+        <w:rPr>
+          <w:color w:val="EE0000"/>
+          <w:sz w:val="32"/>
+          <w:szCs w:val="28"/>
+          <w:highlight w:val="yellow"/>
+        </w:rPr>
+        <w:t>Insert screenshot: Add budget modal</w:t>
+      </w:r>
+    </w:p>
+    <w:p>
+      <w:pPr>
+        <w:rPr>
+          <w:color w:val="EE0000"/>
+          <w:sz w:val="32"/>
+          <w:szCs w:val="28"/>
+          <w:highlight w:val="yellow"/>
+        </w:rPr>
+      </w:pPr>
+    </w:p>
+    <w:p>
+      <w:pPr>
+        <w:rPr>
+          <w:color w:val="EE0000"/>
+          <w:sz w:val="32"/>
+          <w:szCs w:val="28"/>
+        </w:rPr>
+      </w:pPr>
+      <w:r>
+        <w:rPr>
+          <w:color w:val="EE0000"/>
+          <w:sz w:val="32"/>
+          <w:szCs w:val="28"/>
+          <w:highlight w:val="yellow"/>
+        </w:rPr>
+        <w:t>Figure 8.6: Add Budget Modal</w:t>
+      </w:r>
+    </w:p>
+    <w:p>
+      <w:pPr>
+        <w:pStyle w:val="Heading3"/>
+      </w:pPr>
+      <w:r>
+        <w:t xml:space="preserve">Edit </w:t>
+      </w:r>
+      <w:r>
+        <w:t>Budget</w:t>
+      </w:r>
+      <w:r>
+        <w:t xml:space="preserve"> Modal</w:t>
+      </w:r>
+    </w:p>
+    <w:p>
+      <w:r>
+        <w:t xml:space="preserve">The Edit Budget modal supports updating an existing budget limit. </w:t>
+      </w:r>
+      <w:proofErr w:type="gramStart"/>
+      <w:r>
+        <w:t>Similar to</w:t>
+      </w:r>
+      <w:proofErr w:type="gramEnd"/>
+      <w:r>
+        <w:t xml:space="preserve"> editing a transaction, fields are pre-filled with the current budget information. After submission, the service layer validates and updates the stored budget information, and the Budgets page refreshes to show the updated limit.</w:t>
+      </w:r>
+    </w:p>
+    <w:p/>
+    <w:p>
+      <w:pPr>
+        <w:rPr>
+          <w:color w:val="EE0000"/>
+          <w:sz w:val="28"/>
+          <w:szCs w:val="24"/>
+          <w:highlight w:val="yellow"/>
+          <w:u w:val="single"/>
+        </w:rPr>
+      </w:pPr>
+      <w:r>
+        <w:rPr>
+          <w:color w:val="EE0000"/>
+          <w:sz w:val="28"/>
+          <w:szCs w:val="24"/>
+          <w:highlight w:val="yellow"/>
+          <w:u w:val="single"/>
+        </w:rPr>
+        <w:t>Insert screenshot: Edit budget modal (if available)</w:t>
+      </w:r>
+    </w:p>
+    <w:p>
+      <w:pPr>
+        <w:rPr>
+          <w:color w:val="EE0000"/>
+          <w:sz w:val="28"/>
+          <w:szCs w:val="24"/>
+          <w:highlight w:val="yellow"/>
+          <w:u w:val="single"/>
+        </w:rPr>
+      </w:pPr>
+    </w:p>
+    <w:p>
+      <w:pPr>
+        <w:rPr>
+          <w:color w:val="EE0000"/>
+          <w:sz w:val="28"/>
+          <w:szCs w:val="24"/>
+          <w:u w:val="single"/>
+        </w:rPr>
+      </w:pPr>
+      <w:r>
+        <w:rPr>
+          <w:color w:val="EE0000"/>
+          <w:sz w:val="28"/>
+          <w:szCs w:val="24"/>
+          <w:highlight w:val="yellow"/>
+          <w:u w:val="single"/>
+        </w:rPr>
+        <w:t>Figure 8.7: Edit Budget Modal</w:t>
+      </w:r>
+    </w:p>
+    <w:p>
+      <w:pPr>
+        <w:pStyle w:val="Heading3"/>
+      </w:pPr>
+      <w:r>
+        <w:t xml:space="preserve">Delete </w:t>
+      </w:r>
+      <w:r>
+        <w:t>Budget</w:t>
+      </w:r>
+      <w:r>
+        <w:t xml:space="preserve"> Confirmation</w:t>
+      </w:r>
+    </w:p>
+    <w:p>
+      <w:r>
+        <w:t>The Delete Budget flow is implemented with a confirmation dialog to avoid accidental deletions. After the user confirms deletion, the controller removes the selected budget through the service layer, and the Budgets page refreshes to reflect the change.</w:t>
+      </w:r>
+    </w:p>
+    <w:p/>
+    <w:p>
+      <w:pPr>
+        <w:rPr>
+          <w:color w:val="EE0000"/>
+          <w:sz w:val="28"/>
+          <w:szCs w:val="24"/>
+          <w:highlight w:val="yellow"/>
+        </w:rPr>
+      </w:pPr>
+      <w:r>
+        <w:rPr>
+          <w:color w:val="EE0000"/>
+          <w:sz w:val="28"/>
+          <w:szCs w:val="24"/>
+          <w:highlight w:val="yellow"/>
+        </w:rPr>
+        <w:t>Insert screenshot: Delete budget confirmation (if available)</w:t>
+      </w:r>
+    </w:p>
+    <w:p>
+      <w:pPr>
+        <w:rPr>
+          <w:color w:val="EE0000"/>
+          <w:sz w:val="28"/>
+          <w:szCs w:val="24"/>
+          <w:highlight w:val="yellow"/>
+        </w:rPr>
+      </w:pPr>
+    </w:p>
+    <w:p>
+      <w:pPr>
+        <w:rPr>
+          <w:color w:val="EE0000"/>
+          <w:sz w:val="28"/>
+          <w:szCs w:val="24"/>
+        </w:rPr>
+      </w:pPr>
+      <w:r>
+        <w:rPr>
+          <w:color w:val="EE0000"/>
+          <w:sz w:val="28"/>
+          <w:szCs w:val="24"/>
+          <w:highlight w:val="yellow"/>
+        </w:rPr>
+        <w:t>Figure 8.8: Delete Budget Confirmation Dialog</w:t>
+      </w:r>
+    </w:p>
+    <w:p>
+      <w:pPr>
+        <w:pStyle w:val="Heading3"/>
+      </w:pPr>
+      <w:r>
+        <w:lastRenderedPageBreak/>
+        <w:t>Reports UI</w:t>
+      </w:r>
+    </w:p>
+    <w:p>
+      <w:pPr>
+        <w:pStyle w:val="Heading3"/>
+      </w:pPr>
+      <w:r>
+        <w:t>Summary Report Page</w:t>
+      </w:r>
+    </w:p>
+    <w:p>
+      <w:r>
+        <w:t xml:space="preserve">The Summary Report page allows users to generate and view spending summaries for a selected </w:t>
+      </w:r>
+      <w:proofErr w:type="gramStart"/>
+      <w:r>
+        <w:t>time period</w:t>
+      </w:r>
+      <w:proofErr w:type="gramEnd"/>
+      <w:r>
+        <w:t>. The user chooses a date range (or report period), and the system generates a report that summarizes totals and category breakdowns using the report service. The output is displayed in a readable format so the user can quickly understand spending patterns. This page demonstrates the reporting workflow and how the UI consumes structured report results produced by the service layer.</w:t>
+      </w:r>
+    </w:p>
+    <w:p/>
+    <w:p>
+      <w:pPr>
+        <w:rPr>
+          <w:color w:val="EE0000"/>
+          <w:sz w:val="28"/>
+          <w:szCs w:val="24"/>
+          <w:highlight w:val="yellow"/>
+        </w:rPr>
+      </w:pPr>
+      <w:r>
+        <w:rPr>
+          <w:color w:val="EE0000"/>
+          <w:sz w:val="28"/>
+          <w:szCs w:val="24"/>
+          <w:highlight w:val="yellow"/>
+        </w:rPr>
+        <w:t>Insert screenshot: Report page</w:t>
+      </w:r>
+    </w:p>
+    <w:p>
+      <w:pPr>
+        <w:rPr>
+          <w:color w:val="EE0000"/>
+          <w:sz w:val="28"/>
+          <w:szCs w:val="24"/>
+          <w:highlight w:val="yellow"/>
+        </w:rPr>
+      </w:pPr>
+    </w:p>
+    <w:p>
+      <w:pPr>
+        <w:rPr>
+          <w:color w:val="EE0000"/>
+          <w:sz w:val="28"/>
+          <w:szCs w:val="24"/>
+        </w:rPr>
+      </w:pPr>
+      <w:r>
+        <w:rPr>
+          <w:color w:val="EE0000"/>
+          <w:sz w:val="28"/>
+          <w:szCs w:val="24"/>
+          <w:highlight w:val="yellow"/>
+        </w:rPr>
+        <w:t>Figure 8.9: Summary Report Page (Generated Results View)</w:t>
+      </w:r>
+    </w:p>
+    <w:p>
+      <w:pPr>
+        <w:pStyle w:val="Heading2"/>
+      </w:pPr>
+      <w:r>
+        <w:t>Notes on Current GUI Scope (Iteration 3.1)</w:t>
+      </w:r>
+    </w:p>
+    <w:p>
+      <w:r>
+        <w:t>In this iteration, the GUI is implemented to demonstrate the full workflow of the main features during an active session, including transactions, budgets, and report generation. The interface is connected to the business logic through controllers and services, and it supports validation and user feedback through dialogs. Further improvements (such as persistence integration and additional UI polish) will be completed in the next deliverable.</w:t>
+      </w:r>
+    </w:p>
+    <w:p>
       <w:pPr>
         <w:pStyle w:val="Heading1"/>
       </w:pPr>
@@ -5482,7 +6193,6 @@
         <w:rPr>
           <w:bCs/>
         </w:rPr>
-        <w:lastRenderedPageBreak/>
         <w:t>Repository Link</w:t>
       </w:r>
       <w:r>
@@ -5506,6 +6216,7 @@
       </w:pPr>
       <w:bookmarkStart w:id="35" w:name="_Toc222049269"/>
       <w:r>
+        <w:lastRenderedPageBreak/>
         <w:t>Conclusion</w:t>
       </w:r>
       <w:bookmarkEnd w:id="35"/>
@@ -18119,7 +18830,7 @@
   <w:style w:type="paragraph" w:default="1" w:styleId="Normal">
     <w:name w:val="Normal"/>
     <w:qFormat/>
-    <w:rsid w:val="003A0D5B"/>
+    <w:rsid w:val="009754F7"/>
     <w:pPr>
       <w:spacing w:line="360" w:lineRule="auto"/>
       <w:ind w:firstLine="567"/>

</xml_diff>

<commit_message>
Add screenshots for Budgets
</commit_message>
<xml_diff>
--- a/docs/deliverables/3.1/Deliverable 3-1 Design and GUI- Submission - Submission.docx
+++ b/docs/deliverables/3.1/Deliverable 3-1 Design and GUI- Submission - Submission.docx
@@ -393,7 +393,7 @@
     </w:p>
     <w:sdt>
       <w:sdtPr>
-        <w:id w:val="-1840117825"/>
+        <w:id w:val="-1404710246"/>
         <w:docPartObj>
           <w:docPartGallery w:val="Table of Contents"/>
           <w:docPartUnique w:val="1"/>
@@ -7080,12 +7080,12 @@
           <wp:inline distB="114300" distT="114300" distL="114300" distR="114300">
             <wp:extent cx="5731200" cy="3568700"/>
             <wp:effectExtent b="0" l="0" r="0" t="0"/>
-            <wp:docPr id="2" name="image1.png"/>
+            <wp:docPr id="6" name="image5.png"/>
             <a:graphic>
               <a:graphicData uri="http://schemas.openxmlformats.org/drawingml/2006/picture">
                 <pic:pic>
                   <pic:nvPicPr>
-                    <pic:cNvPr id="0" name="image1.png"/>
+                    <pic:cNvPr id="0" name="image5.png"/>
                     <pic:cNvPicPr preferRelativeResize="0"/>
                   </pic:nvPicPr>
                   <pic:blipFill>
@@ -7217,12 +7217,12 @@
           <wp:inline distB="114300" distT="114300" distL="114300" distR="114300">
             <wp:extent cx="5731200" cy="3556000"/>
             <wp:effectExtent b="0" l="0" r="0" t="0"/>
-            <wp:docPr id="1" name="image3.png"/>
+            <wp:docPr id="1" name="image2.png"/>
             <a:graphic>
               <a:graphicData uri="http://schemas.openxmlformats.org/drawingml/2006/picture">
                 <pic:pic>
                   <pic:nvPicPr>
-                    <pic:cNvPr id="0" name="image3.png"/>
+                    <pic:cNvPr id="0" name="image2.png"/>
                     <pic:cNvPicPr preferRelativeResize="0"/>
                   </pic:nvPicPr>
                   <pic:blipFill>
@@ -7451,12 +7451,12 @@
           <wp:inline distB="114300" distT="114300" distL="114300" distR="114300">
             <wp:extent cx="5731200" cy="3556000"/>
             <wp:effectExtent b="0" l="0" r="0" t="0"/>
-            <wp:docPr id="3" name="image2.png"/>
+            <wp:docPr id="7" name="image3.png"/>
             <a:graphic>
               <a:graphicData uri="http://schemas.openxmlformats.org/drawingml/2006/picture">
                 <pic:pic>
                   <pic:nvPicPr>
-                    <pic:cNvPr id="0" name="image2.png"/>
+                    <pic:cNvPr id="0" name="image3.png"/>
                     <pic:cNvPicPr preferRelativeResize="0"/>
                   </pic:nvPicPr>
                   <pic:blipFill>
@@ -7586,6 +7586,46 @@
       </w:pPr>
       <w:r>
         <w:rPr>
+          <w:color w:val="ee0000"/>
+          <w:sz w:val="32"/>
+          <w:szCs w:val="32"/>
+          <w:highlight w:val="yellow"/>
+        </w:rPr>
+        <w:drawing>
+          <wp:inline distB="114300" distT="114300" distL="114300" distR="114300">
+            <wp:extent cx="5731200" cy="3581400"/>
+            <wp:effectExtent b="0" l="0" r="0" t="0"/>
+            <wp:docPr id="2" name="image1.png"/>
+            <a:graphic>
+              <a:graphicData uri="http://schemas.openxmlformats.org/drawingml/2006/picture">
+                <pic:pic>
+                  <pic:nvPicPr>
+                    <pic:cNvPr id="0" name="image1.png"/>
+                    <pic:cNvPicPr preferRelativeResize="0"/>
+                  </pic:nvPicPr>
+                  <pic:blipFill>
+                    <a:blip r:embed="rId12"/>
+                    <a:srcRect b="0" l="0" r="0" t="0"/>
+                    <a:stretch>
+                      <a:fillRect/>
+                    </a:stretch>
+                  </pic:blipFill>
+                  <pic:spPr>
+                    <a:xfrm>
+                      <a:off x="0" y="0"/>
+                      <a:ext cx="5731200" cy="3581400"/>
+                    </a:xfrm>
+                    <a:prstGeom prst="rect"/>
+                    <a:ln/>
+                  </pic:spPr>
+                </pic:pic>
+              </a:graphicData>
+            </a:graphic>
+          </wp:inline>
+        </w:drawing>
+      </w:r>
+      <w:r>
+        <w:rPr>
           <w:rtl w:val="0"/>
         </w:rPr>
       </w:r>
@@ -7683,6 +7723,46 @@
       </w:pPr>
       <w:r>
         <w:rPr>
+          <w:color w:val="ee0000"/>
+          <w:sz w:val="32"/>
+          <w:szCs w:val="32"/>
+          <w:highlight w:val="yellow"/>
+        </w:rPr>
+        <w:drawing>
+          <wp:inline distB="114300" distT="114300" distL="114300" distR="114300">
+            <wp:extent cx="5731200" cy="3492500"/>
+            <wp:effectExtent b="0" l="0" r="0" t="0"/>
+            <wp:docPr id="3" name="image4.png"/>
+            <a:graphic>
+              <a:graphicData uri="http://schemas.openxmlformats.org/drawingml/2006/picture">
+                <pic:pic>
+                  <pic:nvPicPr>
+                    <pic:cNvPr id="0" name="image4.png"/>
+                    <pic:cNvPicPr preferRelativeResize="0"/>
+                  </pic:nvPicPr>
+                  <pic:blipFill>
+                    <a:blip r:embed="rId13"/>
+                    <a:srcRect b="0" l="0" r="0" t="0"/>
+                    <a:stretch>
+                      <a:fillRect/>
+                    </a:stretch>
+                  </pic:blipFill>
+                  <pic:spPr>
+                    <a:xfrm>
+                      <a:off x="0" y="0"/>
+                      <a:ext cx="5731200" cy="3492500"/>
+                    </a:xfrm>
+                    <a:prstGeom prst="rect"/>
+                    <a:ln/>
+                  </pic:spPr>
+                </pic:pic>
+              </a:graphicData>
+            </a:graphic>
+          </wp:inline>
+        </w:drawing>
+      </w:r>
+      <w:r>
+        <w:rPr>
           <w:rtl w:val="0"/>
         </w:rPr>
       </w:r>
@@ -7783,6 +7863,47 @@
       </w:pPr>
       <w:r>
         <w:rPr>
+          <w:color w:val="ee0000"/>
+          <w:sz w:val="28"/>
+          <w:szCs w:val="28"/>
+          <w:highlight w:val="yellow"/>
+          <w:u w:val="single"/>
+        </w:rPr>
+        <w:drawing>
+          <wp:inline distB="114300" distT="114300" distL="114300" distR="114300">
+            <wp:extent cx="5731200" cy="3911600"/>
+            <wp:effectExtent b="0" l="0" r="0" t="0"/>
+            <wp:docPr id="4" name="image6.png"/>
+            <a:graphic>
+              <a:graphicData uri="http://schemas.openxmlformats.org/drawingml/2006/picture">
+                <pic:pic>
+                  <pic:nvPicPr>
+                    <pic:cNvPr id="0" name="image6.png"/>
+                    <pic:cNvPicPr preferRelativeResize="0"/>
+                  </pic:nvPicPr>
+                  <pic:blipFill>
+                    <a:blip r:embed="rId14"/>
+                    <a:srcRect b="0" l="0" r="0" t="0"/>
+                    <a:stretch>
+                      <a:fillRect/>
+                    </a:stretch>
+                  </pic:blipFill>
+                  <pic:spPr>
+                    <a:xfrm>
+                      <a:off x="0" y="0"/>
+                      <a:ext cx="5731200" cy="3911600"/>
+                    </a:xfrm>
+                    <a:prstGeom prst="rect"/>
+                    <a:ln/>
+                  </pic:spPr>
+                </pic:pic>
+              </a:graphicData>
+            </a:graphic>
+          </wp:inline>
+        </w:drawing>
+      </w:r>
+      <w:r>
+        <w:rPr>
           <w:rtl w:val="0"/>
         </w:rPr>
       </w:r>
@@ -7882,6 +8003,46 @@
       </w:pPr>
       <w:r>
         <w:rPr>
+          <w:color w:val="ee0000"/>
+          <w:sz w:val="28"/>
+          <w:szCs w:val="28"/>
+          <w:highlight w:val="yellow"/>
+        </w:rPr>
+        <w:drawing>
+          <wp:inline distB="114300" distT="114300" distL="114300" distR="114300">
+            <wp:extent cx="5731200" cy="3784600"/>
+            <wp:effectExtent b="0" l="0" r="0" t="0"/>
+            <wp:docPr id="5" name="image7.png"/>
+            <a:graphic>
+              <a:graphicData uri="http://schemas.openxmlformats.org/drawingml/2006/picture">
+                <pic:pic>
+                  <pic:nvPicPr>
+                    <pic:cNvPr id="0" name="image7.png"/>
+                    <pic:cNvPicPr preferRelativeResize="0"/>
+                  </pic:nvPicPr>
+                  <pic:blipFill>
+                    <a:blip r:embed="rId15"/>
+                    <a:srcRect b="0" l="0" r="0" t="0"/>
+                    <a:stretch>
+                      <a:fillRect/>
+                    </a:stretch>
+                  </pic:blipFill>
+                  <pic:spPr>
+                    <a:xfrm>
+                      <a:off x="0" y="0"/>
+                      <a:ext cx="5731200" cy="3784600"/>
+                    </a:xfrm>
+                    <a:prstGeom prst="rect"/>
+                    <a:ln/>
+                  </pic:spPr>
+                </pic:pic>
+              </a:graphicData>
+            </a:graphic>
+          </wp:inline>
+        </w:drawing>
+      </w:r>
+      <w:r>
+        <w:rPr>
           <w:rtl w:val="0"/>
         </w:rPr>
       </w:r>
@@ -8124,7 +8285,7 @@
       <w:pPr>
         <w:rPr/>
       </w:pPr>
-      <w:hyperlink r:id="rId12">
+      <w:hyperlink r:id="rId16">
         <w:r>
           <w:rPr>
             <w:color w:val="0000ff"/>
@@ -8171,7 +8332,7 @@
       </w:r>
     </w:p>
     <w:sectPr>
-      <w:footerReference r:id="rId13" w:type="default"/>
+      <w:footerReference r:id="rId17" w:type="default"/>
       <w:type w:val="nextPage"/>
       <w:pgSz w:h="16834" w:w="11909" w:orient="portrait"/>
       <w:pgMar w:bottom="1440" w:top="1440" w:left="1440" w:right="1440" w:header="720" w:footer="720"/>

</xml_diff>

<commit_message>
Add screenshots for Reports
</commit_message>
<xml_diff>
--- a/docs/deliverables/3.1/Deliverable 3-1 Design and GUI- Submission - Submission.docx
+++ b/docs/deliverables/3.1/Deliverable 3-1 Design and GUI- Submission - Submission.docx
@@ -393,7 +393,7 @@
     </w:p>
     <w:sdt>
       <w:sdtPr>
-        <w:id w:val="-1404710246"/>
+        <w:id w:val="1205636198"/>
         <w:docPartObj>
           <w:docPartGallery w:val="Table of Contents"/>
           <w:docPartUnique w:val="1"/>
@@ -7080,7 +7080,7 @@
           <wp:inline distB="114300" distT="114300" distL="114300" distR="114300">
             <wp:extent cx="5731200" cy="3568700"/>
             <wp:effectExtent b="0" l="0" r="0" t="0"/>
-            <wp:docPr id="6" name="image5.png"/>
+            <wp:docPr id="9" name="image5.png"/>
             <a:graphic>
               <a:graphicData uri="http://schemas.openxmlformats.org/drawingml/2006/picture">
                 <pic:pic>
@@ -7217,12 +7217,12 @@
           <wp:inline distB="114300" distT="114300" distL="114300" distR="114300">
             <wp:extent cx="5731200" cy="3556000"/>
             <wp:effectExtent b="0" l="0" r="0" t="0"/>
-            <wp:docPr id="1" name="image2.png"/>
+            <wp:docPr id="1" name="image1.png"/>
             <a:graphic>
               <a:graphicData uri="http://schemas.openxmlformats.org/drawingml/2006/picture">
                 <pic:pic>
                   <pic:nvPicPr>
-                    <pic:cNvPr id="0" name="image2.png"/>
+                    <pic:cNvPr id="0" name="image1.png"/>
                     <pic:cNvPicPr preferRelativeResize="0"/>
                   </pic:nvPicPr>
                   <pic:blipFill>
@@ -7451,12 +7451,12 @@
           <wp:inline distB="114300" distT="114300" distL="114300" distR="114300">
             <wp:extent cx="5731200" cy="3556000"/>
             <wp:effectExtent b="0" l="0" r="0" t="0"/>
-            <wp:docPr id="7" name="image3.png"/>
+            <wp:docPr id="10" name="image4.png"/>
             <a:graphic>
               <a:graphicData uri="http://schemas.openxmlformats.org/drawingml/2006/picture">
                 <pic:pic>
                   <pic:nvPicPr>
-                    <pic:cNvPr id="0" name="image3.png"/>
+                    <pic:cNvPr id="0" name="image4.png"/>
                     <pic:cNvPicPr preferRelativeResize="0"/>
                   </pic:nvPicPr>
                   <pic:blipFill>
@@ -7595,12 +7595,12 @@
           <wp:inline distB="114300" distT="114300" distL="114300" distR="114300">
             <wp:extent cx="5731200" cy="3581400"/>
             <wp:effectExtent b="0" l="0" r="0" t="0"/>
-            <wp:docPr id="2" name="image1.png"/>
+            <wp:docPr id="2" name="image2.png"/>
             <a:graphic>
               <a:graphicData uri="http://schemas.openxmlformats.org/drawingml/2006/picture">
                 <pic:pic>
                   <pic:nvPicPr>
-                    <pic:cNvPr id="0" name="image1.png"/>
+                    <pic:cNvPr id="0" name="image2.png"/>
                     <pic:cNvPicPr preferRelativeResize="0"/>
                   </pic:nvPicPr>
                   <pic:blipFill>
@@ -7732,12 +7732,12 @@
           <wp:inline distB="114300" distT="114300" distL="114300" distR="114300">
             <wp:extent cx="5731200" cy="3492500"/>
             <wp:effectExtent b="0" l="0" r="0" t="0"/>
-            <wp:docPr id="3" name="image4.png"/>
+            <wp:docPr id="4" name="image3.png"/>
             <a:graphic>
               <a:graphicData uri="http://schemas.openxmlformats.org/drawingml/2006/picture">
                 <pic:pic>
                   <pic:nvPicPr>
-                    <pic:cNvPr id="0" name="image4.png"/>
+                    <pic:cNvPr id="0" name="image3.png"/>
                     <pic:cNvPicPr preferRelativeResize="0"/>
                   </pic:nvPicPr>
                   <pic:blipFill>
@@ -7873,12 +7873,12 @@
           <wp:inline distB="114300" distT="114300" distL="114300" distR="114300">
             <wp:extent cx="5731200" cy="3911600"/>
             <wp:effectExtent b="0" l="0" r="0" t="0"/>
-            <wp:docPr id="4" name="image6.png"/>
+            <wp:docPr id="5" name="image10.png"/>
             <a:graphic>
               <a:graphicData uri="http://schemas.openxmlformats.org/drawingml/2006/picture">
                 <pic:pic>
                   <pic:nvPicPr>
-                    <pic:cNvPr id="0" name="image6.png"/>
+                    <pic:cNvPr id="0" name="image10.png"/>
                     <pic:cNvPicPr preferRelativeResize="0"/>
                   </pic:nvPicPr>
                   <pic:blipFill>
@@ -8012,12 +8012,12 @@
           <wp:inline distB="114300" distT="114300" distL="114300" distR="114300">
             <wp:extent cx="5731200" cy="3784600"/>
             <wp:effectExtent b="0" l="0" r="0" t="0"/>
-            <wp:docPr id="5" name="image7.png"/>
+            <wp:docPr id="7" name="image9.png"/>
             <a:graphic>
               <a:graphicData uri="http://schemas.openxmlformats.org/drawingml/2006/picture">
                 <pic:pic>
                   <pic:nvPicPr>
-                    <pic:cNvPr id="0" name="image7.png"/>
+                    <pic:cNvPr id="0" name="image9.png"/>
                     <pic:cNvPicPr preferRelativeResize="0"/>
                   </pic:nvPicPr>
                   <pic:blipFill>
@@ -8167,6 +8167,7 @@
           <w:color w:val="ee0000"/>
           <w:sz w:val="28"/>
           <w:szCs w:val="28"/>
+          <w:highlight w:val="yellow"/>
         </w:rPr>
       </w:pPr>
       <w:r>
@@ -8177,7 +8178,238 @@
           <w:highlight w:val="yellow"/>
           <w:rtl w:val="0"/>
         </w:rPr>
-        <w:t xml:space="preserve">Figure 8.9: Summary Report Page (Generated Results View)</w:t>
+        <w:t xml:space="preserve">Figure 8.9: Summary Report P</w:t>
+      </w:r>
+      <w:r>
+        <w:rPr>
+          <w:color w:val="ee0000"/>
+          <w:sz w:val="28"/>
+          <w:szCs w:val="28"/>
+          <w:highlight w:val="yellow"/>
+        </w:rPr>
+        <w:drawing>
+          <wp:inline distB="114300" distT="114300" distL="114300" distR="114300">
+            <wp:extent cx="5731200" cy="3581400"/>
+            <wp:effectExtent b="0" l="0" r="0" t="0"/>
+            <wp:docPr id="6" name="image7.png"/>
+            <a:graphic>
+              <a:graphicData uri="http://schemas.openxmlformats.org/drawingml/2006/picture">
+                <pic:pic>
+                  <pic:nvPicPr>
+                    <pic:cNvPr id="0" name="image7.png"/>
+                    <pic:cNvPicPr preferRelativeResize="0"/>
+                  </pic:nvPicPr>
+                  <pic:blipFill>
+                    <a:blip r:embed="rId16"/>
+                    <a:srcRect b="0" l="0" r="0" t="0"/>
+                    <a:stretch>
+                      <a:fillRect/>
+                    </a:stretch>
+                  </pic:blipFill>
+                  <pic:spPr>
+                    <a:xfrm>
+                      <a:off x="0" y="0"/>
+                      <a:ext cx="5731200" cy="3581400"/>
+                    </a:xfrm>
+                    <a:prstGeom prst="rect"/>
+                    <a:ln/>
+                  </pic:spPr>
+                </pic:pic>
+              </a:graphicData>
+            </a:graphic>
+          </wp:inline>
+        </w:drawing>
+      </w:r>
+      <w:r>
+        <w:rPr>
+          <w:color w:val="ee0000"/>
+          <w:sz w:val="28"/>
+          <w:szCs w:val="28"/>
+          <w:highlight w:val="yellow"/>
+          <w:rtl w:val="0"/>
+        </w:rPr>
+        <w:t xml:space="preserve">age (Generated Results View)</w:t>
+      </w:r>
+    </w:p>
+    <w:p>
+      <w:pPr>
+        <w:rPr>
+          <w:color w:val="ee0000"/>
+          <w:sz w:val="28"/>
+          <w:szCs w:val="28"/>
+          <w:highlight w:val="yellow"/>
+        </w:rPr>
+      </w:pPr>
+      <w:r>
+        <w:rPr>
+          <w:rtl w:val="0"/>
+        </w:rPr>
+      </w:r>
+    </w:p>
+    <w:p>
+      <w:pPr>
+        <w:rPr>
+          <w:color w:val="ee0000"/>
+          <w:sz w:val="28"/>
+          <w:szCs w:val="28"/>
+          <w:highlight w:val="yellow"/>
+        </w:rPr>
+      </w:pPr>
+      <w:r>
+        <w:rPr>
+          <w:color w:val="ee0000"/>
+          <w:sz w:val="28"/>
+          <w:szCs w:val="28"/>
+          <w:highlight w:val="yellow"/>
+          <w:rtl w:val="0"/>
+        </w:rPr>
+        <w:t xml:space="preserve">Added more screenshots for reports page just in case:</w:t>
+      </w:r>
+    </w:p>
+    <w:p>
+      <w:pPr>
+        <w:ind w:left="0" w:firstLine="0"/>
+        <w:rPr>
+          <w:color w:val="ee0000"/>
+          <w:sz w:val="28"/>
+          <w:szCs w:val="28"/>
+          <w:highlight w:val="yellow"/>
+        </w:rPr>
+      </w:pPr>
+      <w:r>
+        <w:rPr>
+          <w:color w:val="ee0000"/>
+          <w:sz w:val="28"/>
+          <w:szCs w:val="28"/>
+          <w:highlight w:val="yellow"/>
+          <w:rtl w:val="0"/>
+        </w:rPr>
+        <w:br w:type="textWrapping"/>
+        <w:t xml:space="preserve">Report for Custom date functionality:</w:t>
+        <w:br w:type="textWrapping"/>
+      </w:r>
+      <w:r>
+        <w:rPr>
+          <w:color w:val="ee0000"/>
+          <w:sz w:val="28"/>
+          <w:szCs w:val="28"/>
+          <w:highlight w:val="yellow"/>
+        </w:rPr>
+        <w:drawing>
+          <wp:inline distB="114300" distT="114300" distL="114300" distR="114300">
+            <wp:extent cx="5731200" cy="3568700"/>
+            <wp:effectExtent b="0" l="0" r="0" t="0"/>
+            <wp:docPr id="8" name="image6.png"/>
+            <a:graphic>
+              <a:graphicData uri="http://schemas.openxmlformats.org/drawingml/2006/picture">
+                <pic:pic>
+                  <pic:nvPicPr>
+                    <pic:cNvPr id="0" name="image6.png"/>
+                    <pic:cNvPicPr preferRelativeResize="0"/>
+                  </pic:nvPicPr>
+                  <pic:blipFill>
+                    <a:blip r:embed="rId17"/>
+                    <a:srcRect b="0" l="0" r="0" t="0"/>
+                    <a:stretch>
+                      <a:fillRect/>
+                    </a:stretch>
+                  </pic:blipFill>
+                  <pic:spPr>
+                    <a:xfrm>
+                      <a:off x="0" y="0"/>
+                      <a:ext cx="5731200" cy="3568700"/>
+                    </a:xfrm>
+                    <a:prstGeom prst="rect"/>
+                    <a:ln/>
+                  </pic:spPr>
+                </pic:pic>
+              </a:graphicData>
+            </a:graphic>
+          </wp:inline>
+        </w:drawing>
+      </w:r>
+      <w:r>
+        <w:rPr>
+          <w:rtl w:val="0"/>
+        </w:rPr>
+      </w:r>
+    </w:p>
+    <w:p>
+      <w:pPr>
+        <w:ind w:left="0" w:firstLine="0"/>
+        <w:rPr>
+          <w:color w:val="ee0000"/>
+          <w:sz w:val="28"/>
+          <w:szCs w:val="28"/>
+          <w:highlight w:val="yellow"/>
+        </w:rPr>
+      </w:pPr>
+      <w:r>
+        <w:rPr>
+          <w:rtl w:val="0"/>
+        </w:rPr>
+      </w:r>
+    </w:p>
+    <w:p>
+      <w:pPr>
+        <w:ind w:left="0" w:firstLine="0"/>
+        <w:rPr>
+          <w:color w:val="ee0000"/>
+          <w:sz w:val="28"/>
+          <w:szCs w:val="28"/>
+          <w:highlight w:val="yellow"/>
+        </w:rPr>
+      </w:pPr>
+      <w:r>
+        <w:rPr>
+          <w:color w:val="ee0000"/>
+          <w:sz w:val="28"/>
+          <w:szCs w:val="28"/>
+          <w:highlight w:val="yellow"/>
+          <w:rtl w:val="0"/>
+        </w:rPr>
+        <w:t xml:space="preserve">Report bar graph version:</w:t>
+        <w:br w:type="textWrapping"/>
+      </w:r>
+      <w:r>
+        <w:rPr>
+          <w:color w:val="ee0000"/>
+          <w:sz w:val="28"/>
+          <w:szCs w:val="28"/>
+          <w:highlight w:val="yellow"/>
+        </w:rPr>
+        <w:drawing>
+          <wp:inline distB="114300" distT="114300" distL="114300" distR="114300">
+            <wp:extent cx="5731200" cy="3581400"/>
+            <wp:effectExtent b="0" l="0" r="0" t="0"/>
+            <wp:docPr id="3" name="image8.png"/>
+            <a:graphic>
+              <a:graphicData uri="http://schemas.openxmlformats.org/drawingml/2006/picture">
+                <pic:pic>
+                  <pic:nvPicPr>
+                    <pic:cNvPr id="0" name="image8.png"/>
+                    <pic:cNvPicPr preferRelativeResize="0"/>
+                  </pic:nvPicPr>
+                  <pic:blipFill>
+                    <a:blip r:embed="rId18"/>
+                    <a:srcRect b="0" l="0" r="0" t="0"/>
+                    <a:stretch>
+                      <a:fillRect/>
+                    </a:stretch>
+                  </pic:blipFill>
+                  <pic:spPr>
+                    <a:xfrm>
+                      <a:off x="0" y="0"/>
+                      <a:ext cx="5731200" cy="3581400"/>
+                    </a:xfrm>
+                    <a:prstGeom prst="rect"/>
+                    <a:ln/>
+                  </pic:spPr>
+                </pic:pic>
+              </a:graphicData>
+            </a:graphic>
+          </wp:inline>
+        </w:drawing>
       </w:r>
       <w:r>
         <w:rPr>
@@ -8285,7 +8517,7 @@
       <w:pPr>
         <w:rPr/>
       </w:pPr>
-      <w:hyperlink r:id="rId16">
+      <w:hyperlink r:id="rId19">
         <w:r>
           <w:rPr>
             <w:color w:val="0000ff"/>
@@ -8332,7 +8564,7 @@
       </w:r>
     </w:p>
     <w:sectPr>
-      <w:footerReference r:id="rId17" w:type="default"/>
+      <w:footerReference r:id="rId20" w:type="default"/>
       <w:type w:val="nextPage"/>
       <w:pgSz w:h="16834" w:w="11909" w:orient="portrait"/>
       <w:pgMar w:bottom="1440" w:top="1440" w:left="1440" w:right="1440" w:header="720" w:footer="720"/>

</xml_diff>